<commit_message>
v138: Voter and Convention Ready — §2.7 simplified to Inspectorate reporting (automatic consequences removed, §2.7.a-e deleted, 79 cross-references updated); §2.3 dissolution redesign (fixed-term caretaker model, §2.3.d/e removed, §2.3.c two-scenario split for mid-term vacancy vs term-start failure); §10.2.a legislative pay withholding parallel to government employees during budget failure; §2.9.d cross-chamber clemency review (from prior session); fresh v138 rebuild for formatting consistency
</commit_message>
<xml_diff>
--- a/constitution-v137.docx
+++ b/constitution-v137.docx
@@ -317,17 +317,22 @@
     </w:p>
     <w:p>
       <w:pPr>
-        <w:spacing w:after="60" w:before="60" w:line="280" w:lineRule="auto"/>
-        <w:jc w:val="both"/>
-      </w:pPr>
-      <w:r>
-        <w:rPr>
-          <w:rFonts w:ascii="Times New Roman" w:cs="Times New Roman" w:eastAsia="Times New Roman" w:hAnsi="Times New Roman"/>
-          <w:color w:val="000000"/>
-          <w:sz w:val="22"/>
-          <w:szCs w:val="22"/>
-        </w:rPr>
-        <w:t xml:space="preserve">No person in the custody or control of the Republic, its agents, or any entity acting on its behalf may be subjected to torture, cruel, degrading, or inhumane treatment or punishment under any circumstances. No declared emergency, legislative act, executive order, or military necessity may authorize or excuse a violation. Any official who orders, authorizes, or knowingly permits such treatment commits a criminal offense under federal statute and may trigger Rule Violation proceedings under §2.7 — a constitutional mechanism that triggers automatic suspension from duties and a Senate trial, defined fully at §2.7. This prohibition is permanently unamendable under §15.3.</w:t>
+        <w:spacing w:before="60" w:after="60" w:line="280" w:lineRule="auto"/>
+        <w:jc w:val="both"/>
+      </w:pPr>
+      <w:r>
+        <w:rPr>
+          <w:b/>
+          <w:sz w:val="22"/>
+          <w:color w:val="1B2A4A"/>
+        </w:rPr>
+        <w:t xml:space="preserve">2.7 Constitutional Non-Compliance Reporting: </w:t>
+      </w:r>
+      <w:r>
+        <w:rPr>
+          <w:sz w:val="22"/>
+        </w:rPr>
+        <w:t xml:space="preserve">The Inspectorates publish findings of constitutional non-compliance to the National Record System. These findings are factually grounded, publicly accessible, and do not constitute legal determinations — only courts may make legal conclusions from Inspectorate findings. Constitutional violations are addressed through the ordinary courts and through the political accountability mechanisms established by this Constitution: elections, recall, the constructive no-confidence mechanism, chamber expulsion under §3.6, and criminal prosecution where conduct is criminal. No automatic consequence flows from an Inspectorate finding. The permanent public record on the National Record System is the primary accountability instrument.</w:t>
       </w:r>
     </w:p>
     <w:p>
@@ -1200,7 +1205,7 @@
           <w:sz w:val="22"/>
           <w:szCs w:val="22"/>
         </w:rPr>
-        <w:t xml:space="preserve">Any accused person has the right to full disclosure of all State evidence, including exculpatory evidence, before trial. Willful withholding of exculpatory evidence is grounds for immediate dismissal of the case and may trigger Rule Violation proceedings under §2.7.</w:t>
+        <w:t>Any accused person has the right to full disclosure of all State evidence, including exculpatory evidence, before trial. Willful withholding of exculpatory evidence is grounds for immediate dismissal of the case and is reported to the National Record System by the relevant Inspectorate.7.</w:t>
       </w:r>
     </w:p>
     <w:p>
@@ -1297,7 +1302,7 @@
           <w:sz w:val="22"/>
           <w:szCs w:val="22"/>
         </w:rPr>
-        <w:t xml:space="preserve">The right to trial may not be penalised through enhanced sentencing or prosecutorial retaliation. the Legislature must by statute define specific protections against charging decisions and sentencing recommendations made solely on the basis of a defendant's exercise of the right to trial. Violation of statutory protections under this provision is grounds for case dismissal or sentence reduction at the court's discretion and may trigger Rule Violation proceedings under §2.7 against responsible officials. This obligation is self-executing: in the absence of a statute, no prosecutorial decision regarding charges, no plea offer, and no sentencing determination may reference, directly or indirectly, a defendant's exercise of their right to trial as a factor. Any evidence that the exercise of the trial right was treated as a negative factor in charging or sentencing constitutes a constitutional violation remediable by the court on application.</w:t>
+        <w:t>The right to trial may not be penalised through enhanced sentencing or prosecutorial retaliation. the Legislature must by statute define specific protections against charging decisions and sentencing recommendations made solely on the basis of a defendant's exercise of the right to trial. Violation of statutory protections under this provision is grounds for case dismissal or sentence reduction at the court's discretion and is reported to the National Record System by the relevant Inspectorate.7 against responsible officials. This obligation is self-executing: in the absence of a statute, no prosecutorial decision regarding charges, no plea offer, and no sentencing determination may reference, directly or indirectly, a defendant's exercise of their right to trial as a factor. Any evidence that the exercise of the trial right was treated as a negative factor in charging or sentencing constitutes a constitutional violation remediable by the court on application.</w:t>
       </w:r>
     </w:p>
     <w:p>
@@ -1652,7 +1657,7 @@
           <w:sz w:val="22"/>
           <w:szCs w:val="22"/>
         </w:rPr>
-        <w:t xml:space="preserve">No government authority may knowingly expose any community of Inhabitants to environmental contamination and conceal that knowledge from them. Where a government authority knows of environmental contamination caused or permitted by its actions, it must immediately publish that knowledge to the National Record System, notify affected communities directly, and produce a binding remediation plan within a period the Legislature defines by statute. The Legislature may not define remediation timelines that indefinitely defer the obligation — timelines must be proportionate to the nature and scale of the contamination and technically achievable within that period. For any remediation extending beyond two years from the finding of contamination, the responsible party must publish annual progress reports to the National Record System; failure to publish constitutes a continuing violation of this Article. No official may authorize, direct, or participate in the concealment of government-caused or government-permitted environmental harm. Willful concealment triggers Rule Violation proceedings under §2.7.</w:t>
+        <w:t>No government authority may knowingly expose any community of Inhabitants to environmental contamination and conceal that knowledge from them. Where a government authority knows of environmental contamination caused or permitted by its actions, it must immediately publish that knowledge to the National Record System, notify affected communities directly, and produce a binding remediation plan within a period the Legislature defines by statute. The Legislature may not define remediation timelines that indefinitely defer the obligation — timelines must be proportionate to the nature and scale of the contamination and technically achievable within that period. For any remediation extending beyond two years from the finding of contamination, the responsible party must publish annual progress reports to the National Record System; failure to publish constitutes a continuing violation of this Article. No official may authorize, direct, or participate in the concealment of government-caused or government-permitted environmental harm. Willful concealment triggers constitutional violation proceedings.</w:t>
       </w:r>
     </w:p>
     <w:p>
@@ -2124,7 +2129,7 @@
           <w:sz w:val="22"/>
           <w:szCs w:val="22"/>
         </w:rPr>
-        <w:t xml:space="preserve">The President holds authority over national defense and diplomacy, coordinated through a National Security Council the Legislature defines by statute. The Prime Minister holds authority over domestic affairs, coordinated through a Domestic Affairs Council the Legislature defines by statute. The most senior Domestic Affairs Council Officer (SDACO) serves as Caretaker Prime Minister when the PM office is vacant. When a single event implicates both domains simultaneously, both executives act within their respective domains concurrently — neither may claim the whole event to displace the other. To be eligible for the Presidency, a candidate must have held active Citizen status for at least 20 years, be at least 40 years old at inauguration, and must not have been convicted of a constitutional Rule Violation during any prior period of federal service. No person may serve more than one presidential term.</w:t>
+        <w:t>The President holds authority over national defense and diplomacy, coordinated through a National Security Council the Legislature defines by statute. The Prime Minister holds authority over domestic affairs, coordinated through a Domestic Affairs Council the Legislature defines by statute. The most senior Domestic Affairs Council Officer (SDACO) serves as Caretaker Prime Minister when the PM office is vacant. When a single event implicates both domains simultaneously, both executives act within their respective domains concurrently — neither may claim the whole event to displace the other. To be eligible for the Presidency, a candidate must have held active Citizen status for at least 20 years, be at least 40 years old at inauguration, and must not have been convicted of a criminal offense committed while holding federal office during any prior period of federal service. No person may serve more than one presidential term.</w:t>
       </w:r>
     </w:p>
     <w:p>
@@ -2299,7 +2304,7 @@
           <w:sz w:val="22"/>
           <w:szCs w:val="22"/>
         </w:rPr>
-        <w:t xml:space="preserve">Any order for domestic surveillance or intelligence activity directed at Republic citizens is a Rule Violation against the President and the Director of Intelligence, triggering immediate suspension and a Senate trial within 72 hours under §2.7.</w:t>
+        <w:t>Any order for domestic surveillance or intelligence activity directed at Republic citizens is constitutionally prohibited against the President and the Director of Intelligence, which the Inspectorates report to the National Record System.</w:t>
       </w:r>
     </w:p>
     <w:p>
@@ -2340,7 +2345,7 @@
           <w:sz w:val="22"/>
           <w:szCs w:val="22"/>
         </w:rPr>
-        <w:t xml:space="preserve">2.1.f.i Judicial Review and Override: The Supreme Court reviews any veto within 48 hours on petition from either chamber's Speaker on two independent grounds: scope and justification. A veto found out of scope or unjustified is void and is a Rule Violation. Where the Court finds the concern applies to specific severable provisions rather than the bill's core subject, the President must identify those provisions; the Prime Minister and House Speaker may jointly accept the severance and re-present the remainder for enactment without restarting the Legislative Review Period. Override requires a 2/3 vote in both chambers simultaneously.</w:t>
+        <w:t>2.1.f.i Judicial Review and Override: The Supreme Court reviews any veto within 48 hours on petition from either chamber's Speaker on two independent grounds: scope and justification. A veto found out of scope or unjustified is void. Where the Court finds the concern applies to specific severable provisions rather than the bill's core subject, the President must identify those provisions; the Prime Minister and House Speaker may jointly accept the severance and re-present the remainder for enactment without restarting the Legislative Review Period. Override requires a 2/3 vote in both chambers simultaneously.</w:t>
       </w:r>
     </w:p>
     <w:p>
@@ -2381,7 +2386,7 @@
           <w:sz w:val="22"/>
           <w:szCs w:val="22"/>
         </w:rPr>
-        <w:t xml:space="preserve">The President may grant clemency — pardon, commutation, or reprieve — for individual offenses arising under military law, national security statutes, or laws governing the conduct of foreign affairs. Before granting clemency, the President must request a factual background report from the Executive Inspectorate; the EI publishes its report to the National Record System. Clemency may not be granted for: a Rule Violation under §2.7; any offense in which the President was a participant, co-conspirator, or direct beneficiary; any offense committed by a current or former official abusing their official position; or any offense for which the convicted person is simultaneously subject to Rule Violation proceedings. The President may not grant clemency to themselves. Every petition, every EI report, and every grant or decline is published to the National Record System permanently.</w:t>
+        <w:t>The President may grant clemency — pardon, commutation, or reprieve — for individual offenses arising under military law, national security statutes, or laws governing the conduct of foreign affairs. Before granting clemency, the President must request a factual background report from the Executive Inspectorate; the EI publishes its report to the National Record System. Clemency may not be granted for: any offense in which the granting official was a participant, co-conspirator, or direct beneficiary; any offense in which the President was a participant, co-conspirator, or direct beneficiary; any offense committed by a current or former official abusing their official position; or any offense for which the convicted person is simultaneously subject to constitutional violation proceedings. The President may not grant clemency to themselves. Every petition, every EI report, and every grant or decline is published to the National Record System permanently.</w:t>
       </w:r>
     </w:p>
     <w:p>
@@ -2560,7 +2565,7 @@
           <w:sz w:val="22"/>
           <w:szCs w:val="22"/>
         </w:rPr>
-        <w:t xml:space="preserve">2.2.d.i Civil Service Statutory Mandate and Rule Violation: the Legislature must by statute establish a Civil Service Commission with independent oversight of hiring, promotion, and disciplinary processes within the civil service. Directing civil service hiring, firing, or assignment based on political affiliation rather than merit — by the PM or any other official — is a Rule Violation.</w:t>
+        <w:t>2.2.d.i Civil Service Statutory Mandate and constitutional violation: the Legislature must by statute establish a Civil Service Commission with independent oversight of hiring, promotion, and disciplinary processes within the civil service. Directing civil service hiring, firing, or assignment based on political affiliation rather than merit — by the PM or any other official — is prohibited.</w:t>
       </w:r>
     </w:p>
     <w:p>
@@ -2612,7 +2617,7 @@
           <w:sz w:val="22"/>
           <w:szCs w:val="22"/>
         </w:rPr>
-        <w:t xml:space="preserve">The Prime Minister may grant clemency — pardon, commutation, or reprieve — for individual offenses arising under domestic criminal law. Before granting clemency, the PM must request a factual background report from the Executive Inspectorate; the EI publishes its report to the National Record System. The same exclusions apply as under §2.1.g: no clemency for Rule Violations, for offenses in which the PM was a participant or beneficiary, for offenses committed by officials abusing their position, or for persons simultaneously subject to Rule Violation proceedings. The PM may not grant clemency to themselves. Every petition, EI report, and executive decision is published to the National Record System permanently.</w:t>
+        <w:t>The Prime Minister may grant clemency — pardon, commutation, or reprieve — for individual offenses arising under domestic criminal law. Before granting clemency, the PM must request a factual background report from the Executive Inspectorate; the EI publishes its report to the National Record System. The same exclusions apply as under §2.1.g: no clemency for offenses in which the PM was a participant or beneficiary, for offenses committed by officials abusing their position, or for persons simultaneously subject to constitutional violation proceedings. The PM may not grant clemency to themselves. Every petition, EI report, and executive decision is published to the National Record System permanently.</w:t>
       </w:r>
     </w:p>
     <w:p>
@@ -2703,28 +2708,22 @@
     </w:p>
     <w:p>
       <w:pPr>
-        <w:spacing w:after="60" w:before="60" w:line="280" w:lineRule="auto"/>
-        <w:jc w:val="both"/>
-      </w:pPr>
-      <w:r>
-        <w:rPr>
-          <w:rFonts w:ascii="Times New Roman" w:cs="Times New Roman" w:eastAsia="Times New Roman" w:hAnsi="Times New Roman"/>
-          <w:b/>
-          <w:bCs/>
-          <w:color w:val="1B2A4A"/>
-          <w:sz w:val="22"/>
-          <w:szCs w:val="22"/>
+        <w:spacing w:before="60" w:after="60" w:line="280" w:lineRule="auto"/>
+        <w:jc w:val="both"/>
+      </w:pPr>
+      <w:r>
+        <w:rPr>
+          <w:b/>
+          <w:sz w:val="22"/>
+          <w:color w:val="1B2A4A"/>
         </w:rPr>
         <w:t xml:space="preserve">2.3.a Selection: </w:t>
       </w:r>
       <w:r>
         <w:rPr>
-          <w:rFonts w:ascii="Times New Roman" w:cs="Times New Roman" w:eastAsia="Times New Roman" w:hAnsi="Times New Roman"/>
-          <w:color w:val="000000"/>
-          <w:sz w:val="22"/>
-          <w:szCs w:val="22"/>
-        </w:rPr>
-        <w:t xml:space="preserve">The House selects the Prime Minister by absolute majority — meaning a majority of the full seated membership, not merely those present or voting; this definition of absolute majority applies throughout this Constitution wherever the term appears. Failure to seat a PM within a period the Legislature defines by statute — not to exceed 60 days — results in dissolution of the entire House. the Legislature must by statute define the consequences for members who fail to participate in good faith during the selection period; the consequences must include, at minimum, a bar on standing for election to any federal office for at least one full House electoral cycle following the dissolution. the Legislature must also provide that members who cast at least one affirmative vote for any PM candidate during the selection period are exempt from any such bar. Upon dissolution, the Senate Speaker calls new House elections within 30 days; the new House must be fully seated within 60 days of dissolution.</w:t>
+          <w:sz w:val="22"/>
+        </w:rPr>
+        <w:t xml:space="preserve">The House selects the Prime Minister by absolute majority — a majority of the full seated membership, not merely those present or voting; this definition of absolute majority applies throughout this Constitution wherever the term appears. The House must seat a PM within 60 days of its first convening following a general election. If no PM is seated within 60 days, the Caretaker Protocol of §2.3.c activates automatically. The House continues in full session and retains the ability to seat a PM at any time — any successful absolute majority confidence vote immediately displaces the caretaker. During any caretaker period arising from failure to seat a PM, the Legislative Inspectorate publishes a weekly report to the National Record System documenting: the PM formation votes taken, the candidates proposed, and each member's individual participation record. This record is publicly accessible and forms the permanent constitutional accountability record for each member's term.</w:t>
       </w:r>
     </w:p>
     <w:p>
@@ -2755,80 +2754,22 @@
     </w:p>
     <w:p>
       <w:pPr>
-        <w:spacing w:after="60" w:before="60" w:line="280" w:lineRule="auto"/>
-        <w:jc w:val="both"/>
-      </w:pPr>
-      <w:r>
-        <w:rPr>
-          <w:rFonts w:ascii="Times New Roman" w:cs="Times New Roman" w:eastAsia="Times New Roman" w:hAnsi="Times New Roman"/>
-          <w:b/>
-          <w:bCs/>
-          <w:color w:val="1B2A4A"/>
-          <w:sz w:val="22"/>
-          <w:szCs w:val="22"/>
+        <w:spacing w:before="60" w:after="60" w:line="280" w:lineRule="auto"/>
+        <w:jc w:val="both"/>
+      </w:pPr>
+      <w:r>
+        <w:rPr>
+          <w:b/>
+          <w:sz w:val="22"/>
+          <w:color w:val="1B2A4A"/>
         </w:rPr>
         <w:t xml:space="preserve">2.3.c Caretaker Protocol: </w:t>
       </w:r>
       <w:r>
         <w:rPr>
-          <w:rFonts w:ascii="Times New Roman" w:cs="Times New Roman" w:eastAsia="Times New Roman" w:hAnsi="Times New Roman"/>
-          <w:color w:val="000000"/>
-          <w:sz w:val="22"/>
-          <w:szCs w:val="22"/>
-        </w:rPr>
-        <w:t xml:space="preserve">The Senior Domestic Affairs Council Officer serves as Caretaker PM during any PM vacancy, restricted to maintenance of existing obligations only. No new policy or spending may be initiated during the interim. Exception — Domestic Emergency: The Caretaker PM retains the full domestic emergency authority of §2.2.e during any vacancy period. Exception — Military Fund Certification: The Caretaker PM retains the full fund certification authority of §2.1.d for military operations that were active and duly authorized at the date of the PM vacancy — including ongoing Tier 2 and Tier 3 operations. The Caretaker PM may not issue fund certification for a new Tier 2 authorization arising during the vacancy period unless the Senate Armed Services Committee has additionally certified in writing that operational necessity requires immediate fund authorization before a permanent PM can be seated. That certification is published to the National Record System within 6 hours of issuance. A declared domestic emergency by a Caretaker PM follows the same parliamentary ratification requirement of §2.2.e as any other domestic emergency declaration. Emergencies do not pause for governance transitions; the constitutional framework must remain capable of responding regardless of whether a permanent PM has been seated.</w:t>
-      </w:r>
-    </w:p>
-    <w:p>
-      <w:pPr>
-        <w:spacing w:after="60" w:before="60" w:line="280" w:lineRule="auto"/>
-        <w:jc w:val="both"/>
-      </w:pPr>
-      <w:r>
-        <w:rPr>
-          <w:rFonts w:ascii="Times New Roman" w:cs="Times New Roman" w:eastAsia="Times New Roman" w:hAnsi="Times New Roman"/>
-          <w:b/>
-          <w:bCs/>
-          <w:color w:val="1B2A4A"/>
-          <w:sz w:val="22"/>
-          <w:szCs w:val="22"/>
-        </w:rPr>
-        <w:t xml:space="preserve">2.3.d Post-Dissolution Election Bar: </w:t>
-      </w:r>
-      <w:r>
-        <w:rPr>
-          <w:rFonts w:ascii="Times New Roman" w:cs="Times New Roman" w:eastAsia="Times New Roman" w:hAnsi="Times New Roman"/>
-          <w:color w:val="000000"/>
-          <w:sz w:val="22"/>
-          <w:szCs w:val="22"/>
-        </w:rPr>
-        <w:t xml:space="preserve">In any House election triggered by dissolution, no political party or organized faction that held a majority of seats in the dissolved House may field candidates in the emergency election. That organization may return at the next regular election cycle. Members who held minority seats are unaffected. The Post-Dissolution Election Bar and any individual member's mandatory cooling-off period operate independently and neither waives the other. For purposes of this section, a majority of seats means more than half of the total seated membership when dissolution; where no single party holds a majority, the Post-Dissolution Election Bar does not apply to any party.</w:t>
-      </w:r>
-    </w:p>
-    <w:p>
-      <w:pPr>
-        <w:spacing w:after="60" w:before="60" w:line="280" w:lineRule="auto"/>
-        <w:jc w:val="both"/>
-      </w:pPr>
-      <w:r>
-        <w:rPr>
-          <w:rFonts w:ascii="Times New Roman" w:cs="Times New Roman" w:eastAsia="Times New Roman" w:hAnsi="Times New Roman"/>
-          <w:b/>
-          <w:bCs/>
-          <w:color w:val="1B2A4A"/>
-          <w:sz w:val="22"/>
-          <w:szCs w:val="22"/>
-        </w:rPr>
-        <w:t xml:space="preserve">2.3.e Repeated Dissolution Protocol: </w:t>
-      </w:r>
-      <w:r>
-        <w:rPr>
-          <w:rFonts w:ascii="Times New Roman" w:cs="Times New Roman" w:eastAsia="Times New Roman" w:hAnsi="Times New Roman"/>
-          <w:color w:val="000000"/>
-          <w:sz w:val="22"/>
-          <w:szCs w:val="22"/>
-        </w:rPr>
-        <w:t xml:space="preserve">Where a second consecutive dissolution occurs — a newly elected House also failing to seat a PM within the statutory window — the Legislature must by statute establish an escalating consequences framework that includes, at minimum: (1) a shortened PM-selection period for the resulting House; (2) a Senate-nominated Caretaker PM authority with full (not maintenance-only) PM powers for a defined period; (3) a Senate selection mechanism for such a Caretaker PM from candidates who have never held partisan elected office; and (4) a fresh-general-election backstop when the Senate itself deadlocks. The constitutional principle is that successive dissolutions produce increasingly direct Senate intervention and ultimately a clean-slate election with all prior dissolution bars suspended. the Legislature defines the specific sequence, timelines, and thresholds by statute, provided the sequence ends in a new general election if no PM can be seated within the statutory escalation period. In the absence of a statute under this section at the time a second consecutive dissolution occurs, the Senate may by 2/3 vote of its full seated membership appoint a Caretaker PM with full PM authority. The Caretaker PM appointed under this backstop serves until the reconstituted House seats a PM through the ordinary confidence process. This Senate backstop operates only where no statute has been enacted — its first activation constitutes a Notice of Legislative Inaction under §3.3.a requiring the Legislature to enact the statute within the next full session.</w:t>
+          <w:sz w:val="22"/>
+        </w:rPr>
+        <w:t xml:space="preserve">Two distinct scenarios govern the Caretaker Protocol. Vacancy during an active term: Where the PM office becomes vacant mid-term through death, resignation, incapacitation, or a successful constructive vote of no confidence under §2.3.b, the most senior Domestic Affairs Council Officer serves as Caretaker PM, restricted to maintenance of existing obligations only. No new policy or spending may be initiated during the interim. After 90 days of Caretaker service without the House seating a PM, the Senate may by simple majority designate an Interim PM — a person who has never held partisan elected office — with full PM powers. The House retains the ability to seat a PM at any time, immediately displacing the Interim PM. Failure to seat at term start: Where no Domestic Affairs Council exists because no PM has been appointed in the current term, the Senate designates an Interim PM immediately upon the 60-day period expiring. The Senate's designation in this scenario is mandatory — if the House has not seated a PM at day 61, the Senate must act within 14 days to designate an Interim PM from persons who have not held partisan elected office. The Interim PM governs in maintenance-only mode and is immediately displaced by any PM seated through the ordinary House confidence process. If the Senate fails to designate within the 14-day window, the Senate Speaker assumes Interim PM functions in maintenance-only mode until designation occurs. Exceptions applicable in both scenarios: The Caretaker or Interim PM retains the full domestic emergency authority of §2.2.e during any vacancy period. The Caretaker or Interim PM retains fund certification authority under §2.1.d for military operations active and duly authorized at the date of vacancy. The Caretaker or Interim PM may not issue fund certification for a new Tier 2 authorization arising during the vacancy period unless the Senate Armed Services Committee certifies in writing that operational necessity requires immediate authorization before a permanent PM can be seated; that certification is published to the National Record System within 6 hours of issuance.</w:t>
       </w:r>
     </w:p>
     <w:p>
@@ -2940,7 +2881,7 @@
           <w:sz w:val="22"/>
           <w:szCs w:val="22"/>
         </w:rPr>
-        <w:t xml:space="preserve">The suspensive veto provides a deliberation interval and forces the Legislature to recommit to the legislation; it does not convert PM policy preferences into law. Any objection lacking the required written statement is void and is a Rule Violation.</w:t>
+        <w:t>The suspensive veto provides a deliberation interval and forces the Legislature to recommit to the legislation; it does not convert PM policy preferences into law. Any objection lacking the required written statement is void.</w:t>
       </w:r>
     </w:p>
     <w:p>
@@ -3060,7 +3001,7 @@
           <w:sz w:val="22"/>
           <w:szCs w:val="22"/>
         </w:rPr>
-        <w:t xml:space="preserve"> 2.6.b Temporary Acting Presidential Authority: Where the President is temporarily unable to perform presidential functions — due to a planned medical procedure, scheduled absence, or sudden but recoverable incapacity — Acting Presidential Authority may be established through one of two processes: (a) Voluntary Transfer: The President publishes a declaration of temporary transfer to the National Record System, specifying the reason and expected duration. Acting Presidential Authority activates at the moment of NRS publication. (b) Involuntary Certification: Where the President is suddenly incapacitated and cannot make the voluntary declaration, the Prime Minister and the most senior sitting Supreme Court justice jointly certify the incapacity and publish the certification to the National Record System within 6 hours of the incapacity arising. Where the Prime Minister is the next in the succession line and therefore has a conflict of interest in certifying incapacity, the Deputy Speaker substitutes for the Prime Minister in the certification. Acting Presidential Authority activates upon publication of the joint certification. During any period of Acting Presidential Authority: (1) The Senate Speaker exercises all constitutional powers of the presidential office — including Tier 1 through Tier 3 military authority, treaty functions, intelligence oversight, and all other presidential responsibilities — as Acting President; (2) The Senate Speaker retains their Senate seat, which is not vacated during Acting Presidential Authority; (3) The Deputy Speaker assumes the Senate's presiding functions and the Speaker's position in the presidential succession line for the duration of the acting period; (4) No special presidential election is triggered; (5) The acting period does not constitute a succession event within the meaning of §2.6.a or §2.6.c and does not expend or initiate any presidential term. Acting Presidential Authority ends automatically upon: the President publishing a declaration of restoration to the National Record System; or the PM and most senior SC justice jointly certifying and publishing to the NRS that the incapacity has ended. Upon ending, the President immediately resumes full presidential authority, the Senate Speaker resumes their Senate presiding functions, and the Deputy Speaker reverts to the Deputy Speaker role. (c) 90-Day Permanence Assessment: If Acting Presidential Authority extends beyond 90 consecutive days without restoration, the PM and most senior SC justice must jointly assess whether the incapacity has become permanent and publish their assessment to the NRS within 7 days of the 90-day mark. If they certify permanent incapacity, §2.6.a succession activates immediately — Acting Presidential Authority converts to full succession, the Speaker's Senate seat is vacated, and the Deputy Speaker assumes the Speaker role permanently. If they certify continued temporary incapacity, Acting Presidential Authority continues and the assessment repeats every 30 days thereafter until restoration or permanent certification. Failure to conduct and publish the mandatory 90-day assessment within the required period is a Rule Violation for both the PM and the most senior SC justice.</w:t>
+        <w:t xml:space="preserve"> 2.6.b Temporary Acting Presidential Authority: Where the President is temporarily unable to perform presidential functions — due to a planned medical procedure, scheduled absence, or sudden but recoverable incapacity — Acting Presidential Authority may be established through one of two processes: (a) Voluntary Transfer: The President publishes a declaration of temporary transfer to the National Record System, specifying the reason and expected duration. Acting Presidential Authority activates at the moment of NRS publication. (b) Involuntary Certification: Where the President is suddenly incapacitated and cannot make the voluntary declaration, the Prime Minister and the most senior sitting Supreme Court justice jointly certify the incapacity and publish the certification to the National Record System within 6 hours of the incapacity arising. Where the Prime Minister is the next in the succession line and therefore has a conflict of interest in certifying incapacity, the Deputy Speaker substitutes for the Prime Minister in the certification. Acting Presidential Authority activates upon publication of the joint certification. During any period of Acting Presidential Authority: (1) The Senate Speaker exercises all constitutional powers of the presidential office — including Tier 1 through Tier 3 military authority, treaty functions, intelligence oversight, and all other presidential responsibilities — as Acting President; (2) The Senate Speaker retains their Senate seat, which is not vacated during Acting Presidential Authority; (3) The Deputy Speaker assumes the Senate's presiding functions and the Speaker's position in the presidential succession line for the duration of the acting period; (4) No special presidential election is triggered; (5) The acting period does not constitute a succession event within the meaning of §2.6.a or §2.6.c and does not expend or initiate any presidential term. Acting Presidential Authority ends automatically upon: the President publishing a declaration of restoration to the National Record System; or the PM and most senior SC justice jointly certifying and publishing to the NRS that the incapacity has ended. Upon ending, the President immediately resumes full presidential authority, the Senate Speaker resumes their Senate presiding functions, and the Deputy Speaker reverts to the Deputy Speaker role. (c) 90-Day Permanence Assessment: If Acting Presidential Authority extends beyond 90 consecutive days without restoration, the PM and most senior SC justice must jointly assess whether the incapacity has become permanent and publish their assessment to the NRS within 7 days of the 90-day mark. If they certify permanent incapacity, §2.6.a succession activates immediately — Acting Presidential Authority converts to full succession, the Speaker's Senate seat is vacated, and the Deputy Speaker assumes the Speaker role permanently. If they certify continued temporary incapacity, Acting Presidential Authority continues and the assessment repeats every 30 days thereafter until restoration or permanent certification. Failure to conduct and publish the mandatory 90-day assessment within the required period is a constitutional failure for both the PM and the most senior SC justice.</w:t>
       </w:r>
     </w:p>
     <w:p>
@@ -3110,166 +3051,6 @@
     </w:p>
     <w:p>
       <w:pPr>
-        <w:spacing w:after="60" w:before="60" w:line="280" w:lineRule="auto"/>
-        <w:jc w:val="both"/>
-      </w:pPr>
-      <w:r>
-        <w:rPr>
-          <w:rFonts w:ascii="Times New Roman" w:cs="Times New Roman" w:eastAsia="Times New Roman" w:hAnsi="Times New Roman"/>
-          <w:color w:val="000000"/>
-          <w:sz w:val="22"/>
-          <w:szCs w:val="22"/>
-        </w:rPr>
-        <w:t xml:space="preserve">A Supreme Court finding that any official has violated a constitutional rule triggers these automatic consequences: (1) immediate suspension from duties and pay freeze; (2) revocation of access to classified information, government systems, and official vehicles; (3) a Senate trial within the statutory period. These consequences are automatic — no further order, motion, or vote is required to initiate them. They may not be stayed by executive order or by parliamentary motion. The suspension and trial apply whether or not the official contests the underlying finding.</w:t>
-      </w:r>
-    </w:p>
-    <w:p>
-      <w:pPr>
-        <w:spacing w:after="60" w:before="60" w:line="280" w:lineRule="auto"/>
-        <w:jc w:val="both"/>
-      </w:pPr>
-      <w:r>
-        <w:rPr>
-          <w:rFonts w:ascii="Times New Roman" w:cs="Times New Roman" w:eastAsia="Times New Roman" w:hAnsi="Times New Roman"/>
-          <w:color w:val="000000"/>
-          <w:sz w:val="22"/>
-          <w:szCs w:val="22"/>
-        </w:rPr>
-        <w:t xml:space="preserve">Any provision of this Constitution that characterizes an action or omission as subject to Rule Violation proceedings invokes this Section automatically. Cross-references to §2.7 elsewhere in this Constitution are declaratory only. Inspectorate findings do not constitute Rule Violation determinations — only courts may make that legal conclusion. Inspectorate findings are facts that the Legislature, courts, or the People may act upon.</w:t>
-      </w:r>
-    </w:p>
-    <w:p>
-      <w:pPr>
-        <w:spacing w:after="60" w:before="60" w:line="280" w:lineRule="auto"/>
-        <w:jc w:val="both"/>
-      </w:pPr>
-      <w:r>
-        <w:rPr>
-          <w:rFonts w:ascii="Times New Roman" w:cs="Times New Roman" w:eastAsia="Times New Roman" w:hAnsi="Times New Roman"/>
-          <w:b/>
-          <w:bCs/>
-          <w:color w:val="1B2A4A"/>
-          <w:sz w:val="22"/>
-          <w:szCs w:val="22"/>
-        </w:rPr>
-        <w:t xml:space="preserve">2.7.a Former Official Accountability: </w:t>
-      </w:r>
-      <w:r>
-        <w:rPr>
-          <w:rFonts w:ascii="Times New Roman" w:cs="Times New Roman" w:eastAsia="Times New Roman" w:hAnsi="Times New Roman"/>
-          <w:color w:val="000000"/>
-          <w:sz w:val="22"/>
-          <w:szCs w:val="22"/>
-        </w:rPr>
-        <w:t xml:space="preserve">A Supreme Court finding of a constitutional violation for conduct committed while a person held federal office applies regardless of whether the person remains in office when the finding. Where the person has left office, the suspension and Senate trial provisions do not apply — they have no office to suspend from. Instead, the finding triggers automatically: (1) a permanent bar on holding any federal elected or appointed office; and (2) permanent forfeiture of any federal pension or benefit accrued during the period of the violation. Both consequences apply from the date of the court's finding without further proceeding. Criminal liability remains separately pursuable and is not affected by this provision. This lookback applies to constitutional violations for conduct occurring within 5 years before the finding; conduct more than 5 years before the finding date is not subject to the former-official consequences of this sub-section, though criminal prosecution remains available under applicable statutes of limitation.</w:t>
-      </w:r>
-    </w:p>
-    <w:p>
-      <w:pPr>
-        <w:spacing w:after="60" w:before="60" w:line="280" w:lineRule="auto"/>
-        <w:jc w:val="both"/>
-      </w:pPr>
-      <w:r>
-        <w:rPr>
-          <w:rFonts w:ascii="Times New Roman" w:cs="Times New Roman" w:eastAsia="Times New Roman" w:hAnsi="Times New Roman"/>
-          <w:b/>
-          <w:bCs/>
-          <w:color w:val="1B2A4A"/>
-          <w:sz w:val="22"/>
-          <w:szCs w:val="22"/>
-        </w:rPr>
-        <w:t xml:space="preserve">2.7.b Suspension Deferred During Active Military Operations: </w:t>
-      </w:r>
-      <w:r>
-        <w:rPr>
-          <w:rFonts w:ascii="Times New Roman" w:cs="Times New Roman" w:eastAsia="Times New Roman" w:hAnsi="Times New Roman"/>
-          <w:color w:val="000000"/>
-          <w:sz w:val="22"/>
-          <w:szCs w:val="22"/>
-        </w:rPr>
-        <w:t xml:space="preserve">Where the official subject to a Rule Violation finding is the President and active Tier 1, Tier 2, or Tier 3 military operations are underway when the finding, the immediate suspension of §2.7 is deferred until those operations conclude or until the Senate Armed Services Committee certifies that operational continuity does not require the President's personal command authority. During deferral, the automatic Writ of Impeachment is filed and the Senate trial is scheduled, but the President continues in office. The Senate Speaker assumes parallel readiness to assume defense and diplomatic functions on 30 minutes' notice. Deferral may not exceed 30 days; if the Senate trial has not concluded within 30 days of the original finding, the suspension takes effect automatically regardless of operational status. This provision does not apply where the Rule Violation itself concerns the conduct of those military operations. §2.7.b applies only where the constitutional violation is classified as major under §2.7.c — a minor violation under §2.7.c does not trigger suspension and therefore does not engage the deferral mechanism of this provision.</w:t>
-      </w:r>
-    </w:p>
-    <w:p>
-      <w:pPr>
-        <w:spacing w:after="60" w:before="60" w:line="280" w:lineRule="auto"/>
-        <w:jc w:val="both"/>
-      </w:pPr>
-      <w:r>
-        <w:rPr>
-          <w:rFonts w:ascii="Times New Roman" w:cs="Times New Roman" w:eastAsia="Times New Roman" w:hAnsi="Times New Roman"/>
-          <w:b/>
-          <w:bCs/>
-          <w:color w:val="1B2A4A"/>
-          <w:sz w:val="22"/>
-          <w:szCs w:val="22"/>
-        </w:rPr>
-        <w:t xml:space="preserve">2.7.c Minor Violations — Corrective Order Track: </w:t>
-      </w:r>
-      <w:r>
-        <w:rPr>
-          <w:rFonts w:ascii="Times New Roman" w:cs="Times New Roman" w:eastAsia="Times New Roman" w:hAnsi="Times New Roman"/>
-          <w:color w:val="000000"/>
-          <w:sz w:val="22"/>
-          <w:szCs w:val="22"/>
-        </w:rPr>
-        <w:t xml:space="preserve">A violation is minor — triggering the corrective order track rather than suspension — where it is procedural or incidental, the court finds no evidence of deliberate circumvention, the affected rights have not been materially prejudiced, and the official has not previously committed a constitutional violation during the current period of service. In assessing major or minor, the court must consider whether the official self-corrected promptly after the relevant Inspectorate's published finding and before any court proceeding; prompt self-correction weighs toward minor. the Legislature may by statute define what constitutes a new period of service for this purpose.</w:t>
-      </w:r>
-    </w:p>
-    <w:p>
-      <w:pPr>
-        <w:spacing w:after="60" w:before="60" w:line="280" w:lineRule="auto"/>
-        <w:jc w:val="both"/>
-      </w:pPr>
-      <w:r>
-        <w:rPr>
-          <w:rFonts w:ascii="Times New Roman" w:cs="Times New Roman" w:eastAsia="Times New Roman" w:hAnsi="Times New Roman"/>
-          <w:b/>
-          <w:bCs/>
-          <w:color w:val="1B2A4A"/>
-          <w:sz w:val="22"/>
-          <w:szCs w:val="22"/>
-        </w:rPr>
-        <w:t xml:space="preserve">2.7.d Corrective Order Mechanics: </w:t>
-      </w:r>
-      <w:r>
-        <w:rPr>
-          <w:rFonts w:ascii="Times New Roman" w:cs="Times New Roman" w:eastAsia="Times New Roman" w:hAnsi="Times New Roman"/>
-          <w:color w:val="000000"/>
-          <w:sz w:val="22"/>
-          <w:szCs w:val="22"/>
-        </w:rPr>
-        <w:t xml:space="preserve">A corrective order directs the official to rectify the specific violation within a court-defined period, not exceeding 30 days. Failure to comply converts the corrective order to a major violation and triggers the suspension track automatically, without a new court proceeding. Compliance is verified by the relevant Inspectorate and recorded on the National Record System. A corrective order does not constitute a formal Rule Violation finding for purposes of calculating prior violations under §2.7.c.</w:t>
-      </w:r>
-    </w:p>
-    <w:p>
-      <w:pPr>
-        <w:spacing w:after="60" w:before="60" w:line="280" w:lineRule="auto"/>
-        <w:jc w:val="both"/>
-      </w:pPr>
-      <w:r>
-        <w:rPr>
-          <w:rFonts w:ascii="Times New Roman" w:cs="Times New Roman" w:eastAsia="Times New Roman" w:hAnsi="Times New Roman"/>
-          <w:b/>
-          <w:bCs/>
-          <w:color w:val="1B2A4A"/>
-          <w:sz w:val="22"/>
-          <w:szCs w:val="22"/>
-        </w:rPr>
-        <w:t xml:space="preserve">2.7.e Legislative Members — Modified Consequences: </w:t>
-      </w:r>
-      <w:r>
-        <w:rPr>
-          <w:rFonts w:ascii="Times New Roman" w:cs="Times New Roman" w:eastAsia="Times New Roman" w:hAnsi="Times New Roman"/>
-          <w:color w:val="000000"/>
-          <w:sz w:val="22"/>
-          <w:szCs w:val="22"/>
-        </w:rPr>
-        <w:t xml:space="preserve">Where a Supreme Court Rule Violation finding is issued against a sitting member of the House or Senate, the automatic consequences of §2.7 apply with the following modifications: the member is immediately suspended from voting and committee participation (not removed from office); access to classified information and restricted government systems is revoked; and the finding is automatically referred to the relevant chamber's ethics committee, which must commence §3.6 expulsion proceedings within 30 days of the finding. The chamber retains the expulsion decision under §3.6's threshold requirements, but may not decline to commence proceedings following a Rule Violation referral. The Senate trial provision of §2.7 does not apply to legislative members — the §3.6 expulsion process is the exclusive legislative accountability track for members following a Rule Violation finding.</w:t>
-      </w:r>
-    </w:p>
-    <w:p>
-      <w:pPr>
         <w:pBdr>
           <w:bottom w:val="single" w:color="7A7060" w:sz="2" w:space="4"/>
         </w:pBdr>
@@ -3370,7 +3151,7 @@
           <w:sz w:val="22"/>
           <w:szCs w:val="22"/>
         </w:rPr>
-        <w:t xml:space="preserve">Any clemency grant may be challenged before the Supreme Court within 30 days by any person with a concrete injury, on grounds of: violation of the Rule Violation exclusion; violation of the co-conspirator or official-misconduct exclusion; or violation of §1.8 equal protection. The Court reviews constitutional compliance only — not the merits of the decision. A grant found unconstitutional is void and the original sentence reinstated.</w:t>
+        <w:t>Any clemency grant may be challenged before the Supreme Court within 30 days by any person with a concrete injury, on grounds of: violation of the conduct-exclusion grounds; violation of the co-conspirator or official-misconduct exclusion; or violation of §1.8 equal protection. The Court reviews constitutional compliance only — not the merits of the decision. A grant found unconstitutional is void and the original sentence reinstated.</w:t>
       </w:r>
     </w:p>
     <w:p>
@@ -3396,7 +3177,7 @@
           <w:sz w:val="22"/>
           <w:szCs w:val="22"/>
         </w:rPr>
-        <w:t xml:space="preserve">Broad amnesty — the remission of criminal liability for a defined group of persons — is a political act requiring democratic authorization. Only the Legislature may grant amnesty, by statute passed by simple majority of both chambers. No executive may grant group amnesty. Legislative amnesty may not extend to constitutional Rule Violations, to offenses committed by officials using or abusing their official position, or to persons convicted of crimes against the fundamental rights of §1.2 and §1.3. Legislative amnesty statutes are subject to judicial review for constitutional compliance within 60 days of enactment.</w:t>
+        <w:t>Broad amnesty — the remission of criminal liability for a defined group of persons — is a political act requiring democratic authorization. Only the Legislature may grant amnesty, by statute passed by simple majority of both chambers. No executive may grant group amnesty. Legislative amnesty may not extend to constitutional constitutional violations, to offenses committed by officials using or abusing their official position, or to persons convicted of crimes against the fundamental rights of §1.2 and §1.3. Legislative amnesty statutes are subject to judicial review for constitutional compliance within 60 days of enactment.</w:t>
       </w:r>
     </w:p>
     <w:p>
@@ -3422,7 +3203,7 @@
           <w:sz w:val="22"/>
           <w:szCs w:val="22"/>
         </w:rPr>
-        <w:t xml:space="preserve">No elected or appointed official of the Republic may grant clemency to themselves. This prohibition extends to any person convicted of an offense in which the official was a participant, co-conspirator, or direct beneficiary, and to any person whose conviction, if enforced, would directly benefit the official financially, politically, or personally. An attempted self-clemency grant or a grant that violates these extensions is void, constitutes a Rule Violation, and may not be ratified by any subsequent official action.</w:t>
+        <w:t>No elected or appointed official of the Republic may grant clemency to themselves. This prohibition extends to any person convicted of an offense in which the official was a participant, co-conspirator, or direct beneficiary, and to any person whose conviction, if enforced, would directly benefit the official financially, politically, or personally. An attempted self-clemency grant or a grant that violates these extensions is void and may not be ratified by any subsequent official action.</w:t>
       </w:r>
     </w:p>
     <w:p>
@@ -3475,7 +3256,7 @@
           <w:sz w:val="22"/>
           <w:szCs w:val="22"/>
         </w:rPr>
-        <w:t xml:space="preserve">The President may be removed through two political tracks independent of the §2.7 Rule Violation accountability process. These tracks address situations where the President has not committed a technical constitutional violation but has lost the democratic confidence of the Legislature or the citizenry. Both tracks require either cross-institutional consensus or direct citizen participation — they cannot be used as routine political weapons by a simple majority.</w:t>
+        <w:t>The President may be removed through two political tracks independent of Inspectorate reporting and political accountability mechanisms. These tracks address situations where the President has not committed a technical constitutional violation but has lost the democratic confidence of the Legislature or the citizenry. Both tracks require either cross-institutional consensus or direct citizen participation — they cannot be used as routine political weapons by a simple majority.</w:t>
       </w:r>
     </w:p>
     <w:p>
@@ -3501,7 +3282,7 @@
           <w:sz w:val="22"/>
           <w:szCs w:val="22"/>
         </w:rPr>
-        <w:t xml:space="preserve">The House may initiate presidential removal by a vote of 2/3 of its full membership. If the House initiates, the Senate conducts a trial under the mechanics of §3.5.c and may remove the President by a vote of 2/3 of its full membership. Both thresholds are of full seated membership, not merely those present on the day of the vote. This track is independent of and parallel to the §2.7 Rule Violation track and the §3.5 impeachment track. Unlike §3.5 impeachment, which requires only a simple House majority to initiate, this track requires a 2/3 House majority at initiation — a higher threshold reflecting the President's direct electoral mandate. The House vote under this section must be accompanied by a Statement of Grounds — a written document specifying the basis for removal in plain language, published to the National Record System simultaneously with the vote. The Statement of Grounds serves the function of Articles of Impeachment for purposes of the §3.5.c Senate trial mechanics. The Statement must identify specific conduct, decisions, or failures constituting the basis for removal; a general vote of no confidence without specific stated grounds is not sufficient. The Senate trial is limited to the grounds stated — the Senate may not convict on grounds not included in the Statement.</w:t>
+        <w:t>The House may initiate presidential removal by a vote of 2/3 of its full membership. If the House initiates, the Senate conducts a trial under the mechanics of §3.5.c and may remove the President by a vote of 2/3 of its full membership. Both thresholds are of full seated membership, not merely those present on the day of the vote. This track is independent of and parallel to the Inspectorate reporting and political accountability mechanisms and the §3.5 impeachment track. Unlike §3.5 impeachment, which requires only a simple House majority to initiate, this track requires a 2/3 House majority at initiation — a higher threshold reflecting the President's direct electoral mandate. The House vote under this section must be accompanied by a Statement of Grounds — a written document specifying the basis for removal in plain language, published to the National Record System simultaneously with the vote. The Statement of Grounds serves the function of Articles of Impeachment for purposes of the §3.5.c Senate trial mechanics. The Statement must identify specific conduct, decisions, or failures constituting the basis for removal; a general vote of no confidence without specific stated grounds is not sufficient. The Senate trial is limited to the grounds stated — the Senate may not convict on grounds not included in the Statement.</w:t>
       </w:r>
     </w:p>
     <w:p>
@@ -3726,7 +3507,7 @@
           <w:sz w:val="22"/>
           <w:szCs w:val="22"/>
         </w:rPr>
-        <w:t xml:space="preserve">Failure to seat a PM within the statutory period defined under §2.3.a results in dissolution of the entire House. Members who were present and voting during the statutory selection period are subject to the election bar described in §2.3.a, subject to the good-faith participation exemption of that section. The Senate Speaker calls emergency House elections within 30 days. The new House must be fully seated within 60 days of dissolution. The Post-Dissolution Election Bar (§2.3.d) applies to these elections.</w:t>
+        <w:t xml:space="preserve">Failure to seat a PM within the statutory period defined under §2.3.a activates the Caretaker Protocol under §2.3.c. Members who were present and voting during the statutory selection period are subject to the election bar described in §2.3.a, subject to the good-faith participation exemption of that section. The Senate Speaker cremain in office and continue trying to seat a PM as provided in §2.3.a. </w:t>
       </w:r>
     </w:p>
     <w:p>
@@ -3752,7 +3533,7 @@
           <w:sz w:val="22"/>
           <w:szCs w:val="22"/>
         </w:rPr>
-        <w:t xml:space="preserve">No person may serve more than six consecutive 2-year terms in the House of the Legislature — a maximum of 12 consecutive years. After six consecutive terms, the member must sit out one full House electoral cycle (2 years) before standing for the House again. The cooling-off period runs from the date the sixth consecutive term expires, regardless of whether that term was completed or cut short by resignation, recall, or expulsion. After the mandatory cooling-off period, the member is again eligible with no further cumulative lifetime restriction. A partial term served following a mid-term vacancy appointment or special election counts as a full consecutive term for purposes of this limit. The constructive vote, dissolution, and post-dissolution election bar provisions of §2.3 operate independently of this term limit. A member who reaches the 6-term limit and whose cooling-off period coincides with a post-dissolution election bar serves both periods concurrently from the later start date.</w:t>
+        <w:t>No person may serve more than six consecutive 2-year terms in the House of the Legislature — a maximum of 12 consecutive years. After six consecutive terms, the member must sit out one full House electoral cycle (2 years) before standing for the House again. The cooling-off period runs from the date the sixth consecutive term expires, regardless of whether that term was completed or cut short by resignation, recall, or expulsion. After the mandatory cooling-off period, the member is again eligible with no further cumulative lifetime restriction. A partial term served following a mid-term vacancy appointment or special election counts as a full consecutive term for purposes of this limit. The constructive vote, dissolution, and post-dissolution election bar provisions of §2.3 operate independently of this term limit. A member who reaches the 6-term limit and whose cooling-off period coincides with a caretaker period serves the term-limit cooling-off from the later start date.</w:t>
       </w:r>
     </w:p>
     <w:p>
@@ -4293,7 +4074,7 @@
           <w:sz w:val="22"/>
           <w:szCs w:val="22"/>
         </w:rPr>
-        <w:t xml:space="preserve">The following data may not be used at any stage of the district-drawing process: partisan registration data; voting history data; incumbent or candidate residence; and racial or ethnic composition as a primary consideration. Use of prohibited inputs by any person or body involved in district drawing may trigger Rule Violation proceedings under §2.7.</w:t>
+        <w:t>The following data may not be used at any stage of the district-drawing process: partisan registration data; voting history data; incumbent or candidate residence; and racial or ethnic composition as a primary consideration. Use of prohibited inputs by any person or body involved in district drawing is reported to the National Record System by the relevant Inspectorate.7.</w:t>
       </w:r>
     </w:p>
     <w:p>
@@ -4457,7 +4238,7 @@
           <w:sz w:val="22"/>
           <w:szCs w:val="22"/>
         </w:rPr>
-        <w:t xml:space="preserve">This section governs the political impeachment track — initiated by the House and distinct from the automatic Rule Violation consequences of §2.7. This section applies exclusively to executive and judicial officers of the Republic. Legislative members of the House and Senate are not subject to this section — their removal is governed exclusively by §3.6 as the specific provision for legislative self-governance, and by §2.7.e where a Rule Violation finding applies. This clarification resolves any ambiguity arising from the phrase "elected or appointed federal official" — for purposes of this section, that phrase refers to officers of the executive and judicial branches only.</w:t>
+        <w:t>This section governs the political impeachment track — initiated by the House and distinct from the Inspectorate reporting and political accountability mechanisms. This section applies exclusively to executive and judicial officers of the Republic. Legislative members of the House and Senate are not subject to this section — their removal is governed exclusively by §3.6 as the specific provision for legislative self-governance, and by the Inspectorate reporting provisions of §2.7.</w:t>
       </w:r>
     </w:p>
     <w:p>
@@ -4509,7 +4290,7 @@
           <w:sz w:val="22"/>
           <w:szCs w:val="22"/>
         </w:rPr>
-        <w:t xml:space="preserve">The full House votes on Articles of Impeachment by simple majority of the full membership of the House — not merely those present on the day of the vote. Passage transmits the Articles immediately to the Senate and publishes them permanently to the National Record System. The Articles must state specific grounds in plain language. The official continues in office pending the Senate trial; suspension occurs only under §2.7 following a Supreme Court Rule Violation finding, not upon House passage of Articles alone. Where §2.7 suspension is simultaneously in effect, the §2.7 suspension governs — the official is suspended regardless of the §3.5 track status. The two tracks proceed independently and the more restrictive consequence applies.</w:t>
+        <w:t>The full House votes on Articles of Impeachment by simple majority of the full membership of the House — not merely those present on the day of the vote. Passage transmits the Articles immediately to the Senate and publishes them permanently to the National Record System. The Articles must state specific grounds in plain language. The official continues in office pending the Senate trial; suspension occurs only upon the chamber's own constitutional processes, not upon Inspectorate findings alone. Where impeachment and Inspectorate findings coincide, both processes proceed concurrently on their respective tracks status. The two tracks proceed independently and the more restrictive consequence applies.</w:t>
       </w:r>
     </w:p>
     <w:p>
@@ -4971,32 +4752,6 @@
           <w:sz w:val="22"/>
           <w:szCs w:val="22"/>
         </w:rPr>
-        <w:t xml:space="preserve">4.1.c Removal of Inferior Court Judges — Three Tracks: </w:t>
-      </w:r>
-      <w:r>
-        <w:rPr>
-          <w:rFonts w:ascii="Times New Roman" w:cs="Times New Roman" w:eastAsia="Times New Roman" w:hAnsi="Times New Roman"/>
-          <w:color w:val="000000"/>
-          <w:sz w:val="22"/>
-          <w:szCs w:val="22"/>
-        </w:rPr>
-        <w:t xml:space="preserve">Inferior court judges may be removed through three independent tracks. Track 1 — Rule Violation (§2.7): A Supreme Court finding of a constitutional violation triggers automatic suspension, access revocation, and Senate trial on the standard §2.7 track. Track 2 — Judicial Initiation: Requires a 2/3 petition from the Supreme Court, followed by a supermajority conviction vote in the Legislature that the Legislature defines by statute. The Supreme Court petition is a constitutional prerequisite — the Legislature may not proceed to the conviction vote without it, and neither executive may initiate removal without the Supreme Court's formal petition. Track 3 — Political Removal: Mirrors the presidential and Supreme Court political removal architecture: 2/3 of the full House membership to initiate, plus 2/3 of the full Senate membership to convict and remove; OR a simple majority of the full Senate membership to refer the question to a national recall referendum, with removal requiring a majority of eligible voters and one referral permitted per judicial term. This section is the exclusive removal mechanism for inferior court judges. The general impeachment track of §3.5 does not apply to inferior court judges. All removal proceedings and their outcomes are published to the National Record System.</w:t>
-      </w:r>
-    </w:p>
-    <w:p>
-      <w:pPr>
-        <w:spacing w:after="60" w:before="60" w:line="280" w:lineRule="auto"/>
-        <w:jc w:val="both"/>
-      </w:pPr>
-      <w:r>
-        <w:rPr>
-          <w:rFonts w:ascii="Times New Roman" w:cs="Times New Roman" w:eastAsia="Times New Roman" w:hAnsi="Times New Roman"/>
-          <w:b/>
-          <w:bCs/>
-          <w:color w:val="1B2A4A"/>
-          <w:sz w:val="22"/>
-          <w:szCs w:val="22"/>
-        </w:rPr>
         <w:t xml:space="preserve">4.1.d Judicial Tenure Protection: </w:t>
       </w:r>
       <w:r>
@@ -5051,7 +4806,7 @@
           <w:sz w:val="22"/>
           <w:szCs w:val="22"/>
         </w:rPr>
-        <w:t xml:space="preserve">Each open Supreme Court seat is filled through a three-party nomination process. The three Triad nominators are the Senate, the Prime Minister, and the President, each submitting one candidate per vacancy from the Qualified Jurist Registry maintained by the Judicial Inspectorate. All three nominations must be submitted before the citizen election proceeds. This three-party structure — Senate, PM, and President — is referred to as the Triad throughout this Constitution. The Senate replaces the House as a Triad nominator because the Senate's closer institutional relationship with the President — through treaty ratification, judicial confirmations, and Rule Violation trials — produces genuinely distinct institutional perspective from both the PM and the President, while the House's nomination would effectively double the PM's voice given the PM's confidence relationship with the House.</w:t>
+        <w:t>Each open Supreme Court seat is filled through a three-party nomination process. The three Triad nominators are the Senate, the Prime Minister, and the President, each submitting one candidate per vacancy from the Qualified Jurist Registry maintained by the Judicial Inspectorate. All three nominations must be submitted before the citizen election proceeds. This three-party structure — Senate, PM, and President — is referred to as the Triad throughout this Constitution. The Senate replaces the House as a Triad nominator because the Senate's closer institutional relationship with the President — through treaty ratification, judicial confirmations, and constitutional violation trials — produces genuinely distinct institutional perspective from both the PM and the President, while the House's nomination would effectively double the PM's voice given the PM's confidence relationship with the House.</w:t>
       </w:r>
     </w:p>
     <w:p>
@@ -6348,7 +6103,7 @@
           <w:sz w:val="22"/>
           <w:szCs w:val="22"/>
         </w:rPr>
-        <w:t xml:space="preserve">Once an applicant clears both gates, the President must ministerially issue residency credentials within a period the Legislature defines by statute, not to exceed 60 days. The President's role is strictly ministerial — verifying that both gates have been certified and issuing credentials accordingly. The President may not impose additional conditions, delay issuance as a policy instrument, or selectively issue based on national origin or any characteristic enumerated in §1.8. Such actions constitute a Rule Violation and are subject to proceedings under §2.7.</w:t>
+        <w:t>Once an applicant clears both gates, the President must ministerially issue residency credentials within a period the Legislature defines by statute, not to exceed 60 days. The President's role is strictly ministerial — verifying that both gates have been certified and issuing credentials accordingly. The President may not impose additional conditions, delay issuance as a policy instrument, or selectively issue based on national origin or any characteristic enumerated in §1.8. Such actions constitute a constitutional violation and are subject to proceedings.</w:t>
       </w:r>
     </w:p>
     <w:p>
@@ -6576,7 +6331,7 @@
           <w:sz w:val="22"/>
           <w:szCs w:val="22"/>
         </w:rPr>
-        <w:t xml:space="preserve">Any person who claims protection under §1.27 has the right to have that claim determined by an Asylum Court established within the Republic's judicial system under Article IV before any removal order takes effect. The Asylum Court is a federal judicial institution constitutionally independent of both executive branches, with judges appointed through the judicial selection process with full tenure protections, and subject to Supreme Court appellate review on constitutional questions. the Legislature must by statute establish the Asylum Court. the Legislature may not establish any asylum determination body as a subdivision or instrumentality of either executive branch. Failure to establish the Asylum Court within two years of Phase 4 activation is a Rule Violation for the presiding officers of both chambers; federal courts have direct jurisdiction over asylum claims until the Legislature acts.</w:t>
+        <w:t>Any person who claims protection under §1.27 has the right to have that claim determined by an Asylum Court established within the Republic's judicial system under Article IV before any removal order takes effect. The Asylum Court is a federal judicial institution constitutionally independent of both executive branches, with judges appointed through the judicial selection process with full tenure protections, and subject to Supreme Court appellate review on constitutional questions. the Legislature must by statute establish the Asylum Court. the Legislature may not establish any asylum determination body as a subdivision or instrumentality of either executive branch. Failure to establish the Asylum Court within two years of Phase 4 activation is a constitutional failure for the presiding officers of both chambers; federal courts have direct jurisdiction over asylum claims until the Legislature acts.</w:t>
       </w:r>
     </w:p>
     <w:p>
@@ -6628,7 +6383,7 @@
           <w:sz w:val="22"/>
           <w:szCs w:val="22"/>
         </w:rPr>
-        <w:t xml:space="preserve">the Legislature must by statute define a minimum status, material conditions, and periodic judicial review mechanism for persons subject to final removal orders that cannot be executed because no country will accept the person or because §1.27 bars removal to all available destinations. Judicial review must occur at intervals the Legislature defines, not to exceed twelve months. Indefinite unreviewed detention is not a constitutionally available outcome. Failure to define this framework within two years of Phase 4 activation is a Rule Violation for the presiding officers of both chambers.</w:t>
+        <w:t>the Legislature must by statute define a minimum status, material conditions, and periodic judicial review mechanism for persons subject to final removal orders that cannot be executed because no country will accept the person or because §1.27 bars removal to all available destinations. Judicial review must occur at intervals the Legislature defines, not to exceed twelve months. Indefinite unreviewed detention is not a constitutionally available outcome. Failure to define this framework within two years of Phase 4 activation is a constitutional failure for the presiding officers of both chambers.</w:t>
       </w:r>
     </w:p>
     <w:p>
@@ -7051,7 +6806,7 @@
           <w:sz w:val="22"/>
           <w:szCs w:val="22"/>
         </w:rPr>
-        <w:t xml:space="preserve">No State may take any action that reduces National Voting System access, functionality, or processing capacity in its jurisdiction. The Electoral Commission monitors participation rates and reports statistically significant reductions to the Legislative Inspectorate. A confirmed pattern of reduced accessibility may trigger Rule Violation proceedings under §2.7 for the relevant State officials.</w:t>
+        <w:t>No State may take any action that reduces National Voting System access, functionality, or processing capacity in its jurisdiction. The Electoral Commission monitors participation rates and reports statistically significant reductions to the Legislative Inspectorate. A confirmed pattern of reduced accessibility is reported to the National Record System by the relevant Inspectorate.7 for the relevant State officials.</w:t>
       </w:r>
     </w:p>
     <w:p>
@@ -7531,7 +7286,7 @@
           <w:sz w:val="22"/>
           <w:szCs w:val="22"/>
         </w:rPr>
-        <w:t xml:space="preserve">Grounds: documented dereliction of duty, incapacity, undisclosed conflict of interest, or criminal conviction. Requires a 2/3 vote of both chambers simultaneously. Before the legislative vote, the State Designee Panel (§8.9) must publish a verification finding within 30 days of the removal motion being filed. The Panel's finding is published to the National Record System. The Legislature may proceed to the 2/3 vote only after the Panel publishes its finding, regardless of which way the finding goes. If the Panel finds the stated grounds unsubstantiated, that finding is published permanently alongside the removal vote; the motion does not automatically lapse. The IG being removed may petition the Supreme Court within 14 days of the Panel's finding for expedited technical review on whether the Panel applied the correct legal standard — not the merits of the grounds; the IG continues in office during this review. A removal of an Inspector General that achieves the constitutional threshold of this section and has been preceded by the State Designee Panel verification process is not, solely by reason of the political motivation of any voting member or members, a Rule Violation under §2.7 for those members. Motive is not justiciable where the constitutional process is complete. This protection does not extend to false statements in the stated grounds, fabrication of evidence presented to the Panel, or coercion of other members' votes.</w:t>
+        <w:t>Grounds: documented dereliction of duty, incapacity, undisclosed conflict of interest, or criminal conviction. Requires a 2/3 vote of both chambers simultaneously. Before the legislative vote, the State Designee Panel (§8.9) must publish a verification finding within 30 days of the removal motion being filed. The Panel's finding is published to the National Record System. The Legislature may proceed to the 2/3 vote only after the Panel publishes its finding, regardless of which way the finding goes. If the Panel finds the stated grounds unsubstantiated, that finding is published permanently alongside the removal vote; the motion does not automatically lapse. The IG being removed may petition the Supreme Court within 14 days of the Panel's finding for expedited technical review on whether the Panel applied the correct legal standard — not the merits of the grounds; the IG continues in office during this review. A removal of an Inspector General that achieves the constitutional threshold of this section and has been preceded by the State Designee Panel verification process is not, solely by reason of the political motivation of any voting member or members, a constitutional violation for those members. Motive is not justiciable where the constitutional process is complete. This protection does not extend to false statements in the stated grounds, fabrication of evidence presented to the Panel, or coercion of other members' votes.</w:t>
       </w:r>
     </w:p>
     <w:p>
@@ -7617,7 +7372,7 @@
           <w:sz w:val="22"/>
           <w:szCs w:val="22"/>
         </w:rPr>
-        <w:t xml:space="preserve">An Inspectorate finding is not a legal determination of any kind. Inspectorate Reports state observed facts. They do not conclude that any conduct 'is a Rule Violation' — that is a legal conclusion reserved for courts. The Inspectorates have no enforcement power, no arrest authority, no prosecutorial function, and no ability to issue binding orders. Their sole constitutional output is published factual information. Inspectorate Reports may note that the Legislature, courts, or the People may wish to act on what the Reports reveal — but the power to act always belongs to others.</w:t>
+        <w:t>An Inspectorate finding is not a legal determination of any kind. Inspectorate Reports state observed facts. They do not conclude that any conduct 'is constitutionally prohibited' — that is a legal conclusion reserved for courts. The Inspectorates have no enforcement power, no arrest authority, no prosecutorial function, and no ability to issue binding orders. Their sole constitutional output is published factual information. Inspectorate Reports may note that the Legislature, courts, or the People may wish to act on what the Reports reveal — but the power to act always belongs to others.</w:t>
       </w:r>
     </w:p>
     <w:p>
@@ -7695,7 +7450,7 @@
           <w:sz w:val="22"/>
           <w:szCs w:val="22"/>
         </w:rPr>
-        <w:t xml:space="preserve">An Inspectorate Report is a documented statement of observed fact. What the Legislature, the courts, or the People do with that information is their constitutional prerogative. Where a Report's findings may be relevant to potential Rule Violation proceedings, the Report states that the Legislature or the relevant injured party may initiate such proceedings.</w:t>
+        <w:t>An Inspectorate Report is a documented statement of observed fact. What the Legislature, the courts, or the People do with that information is their constitutional prerogative. Where a Report's findings may be relevant to potential constitutional violation proceedings, the Report states that the Legislature or the relevant injured party may initiate such proceedings.</w:t>
       </w:r>
     </w:p>
     <w:p>
@@ -8076,7 +7831,7 @@
           <w:sz w:val="22"/>
           <w:szCs w:val="22"/>
         </w:rPr>
-        <w:t xml:space="preserve">Each Inspectorate is guaranteed adequate annual funding to perform its constitutional mandate fully and independently. the Legislature may not reduce any Inspectorate's funding below the prior fiscal year's appropriation without a 2/3 vote of both chambers, and may never eliminate an Inspectorate's funding. the Legislature must by statute define a specific minimum funding formula indexed to national revenue; the Monetary Authority certifies annually whether that formula is adequate for each Inspectorate's mandate. Failure to appropriate the statutory minimum is a Rule Violation for the presiding officers of each chamber. During a certified Severe Contraction under §10.1.d, the minimum may be proportionally reduced but not eliminated. No parliamentary act, executive order, or budget mechanism may reclassify Inspectorate operating expenses in ways that reduce effective operational capacity below the constitutional funding floor, regardless of whether the nominal appropriated amount remains unchanged. The Monetary Authority certifies actual operational capacity annually, not merely nominal funding compliance, and publishes its certification to the National Record System. The operational capacity certification issued annually by the Monetary Authority is the MA Director's independent constitutional judgment. Neither executive may direct, modify, delay, or suppress the certification. Any acting Monetary Authority Director who issues an operational capacity certification under executive direction or pressure commits a Rule Violation of the same kind as a confirmed Director, subject to the same constitutional accountability framework.</w:t>
+        <w:t>Each Inspectorate is guaranteed adequate annual funding to perform its constitutional mandate fully and independently. the Legislature may not reduce any Inspectorate's funding below the prior fiscal year's appropriation without a 2/3 vote of both chambers, and may never eliminate an Inspectorate's funding. the Legislature must by statute define a specific minimum funding formula indexed to national revenue; the Monetary Authority certifies annually whether that formula is adequate for each Inspectorate's mandate. Failure to appropriate the statutory minimum is a constitutional failure for the presiding officers of each chamber. During a certified Severe Contraction under §10.1.d, the minimum may be proportionally reduced but not eliminated. No parliamentary act, executive order, or budget mechanism may reclassify Inspectorate operating expenses in ways that reduce effective operational capacity below the constitutional funding floor, regardless of whether the nominal appropriated amount remains unchanged. The Monetary Authority certifies actual operational capacity annually, not merely nominal funding compliance, and publishes its certification to the National Record System. The operational capacity certification issued annually by the Monetary Authority is the MA Director's independent constitutional judgment. Neither executive may direct, modify, delay, or suppress the certification. Any acting Monetary Authority Director who issues an operational capacity certification under executive direction or pressure is constitutionally prohibited of the same kind as a confirmed Director, subject to the same constitutional accountability framework.</w:t>
       </w:r>
     </w:p>
     <w:p>
@@ -8121,7 +7876,7 @@
           <w:sz w:val="22"/>
           <w:szCs w:val="22"/>
         </w:rPr>
-        <w:t xml:space="preserve">The three Inspectorates must jointly publish a Constitutional Performance Assessment every eight years, beginning eight years after Phase 4 activation. The Assessment must evaluate: the compliance rate of all constitutional provisions across all branches and institutions; behavioural changes attributable to constitutional mechanisms; provisions that have produced unintended consequences or emerging gaps; and recommendations for legislative or constitutional action. The Assessment is published to the National Record System and transmitted to both chambers, both executives, and the Supreme Court simultaneously. the Legislature must by statute establish the assessment methodology within two years of Phase 4 activation; failure to do so is a Rule Violation for the presiding officers of each chamber, and the Inspectorates shall proceed with their own jointly agreed methodology pending parliamentary action. The Assessment includes a section on compact compliance covering all §19.1 accommodation compacts, §20 Associated Community compacts, and Article XIV indigenous compact obligations, and a specific evaluation of any Transitional Accountability Mechanism that has operated under §19.9. The Assessment carries no binding force — it is an institutional record of constitutional performance, not a directive to any branch.</w:t>
+        <w:t>The three Inspectorates must jointly publish a Constitutional Performance Assessment every eight years, beginning eight years after Phase 4 activation. The Assessment must evaluate: the compliance rate of all constitutional provisions across all branches and institutions; behavioural changes attributable to constitutional mechanisms; provisions that have produced unintended consequences or emerging gaps; and recommendations for legislative or constitutional action. The Assessment is published to the National Record System and transmitted to both chambers, both executives, and the Supreme Court simultaneously. the Legislature must by statute establish the assessment methodology within two years of Phase 4 activation; failure to do so is a constitutional failure for the presiding officers of each chamber, and the Inspectorates shall proceed with their own jointly agreed methodology pending parliamentary action. The Assessment includes a section on compact compliance covering all §19.1 accommodation compacts, §20 Associated Community compacts, and Article XIV indigenous compact obligations, and a specific evaluation of any Transitional Accountability Mechanism that has operated under §19.9. The Assessment carries no binding force — it is an institutional record of constitutional performance, not a directive to any branch.</w:t>
       </w:r>
     </w:p>
     <w:p>
@@ -8451,7 +8206,7 @@
           <w:sz w:val="22"/>
           <w:szCs w:val="22"/>
         </w:rPr>
-        <w:t xml:space="preserve">The RSA Director is nominated by the Prime Minister from a Candidate Register. RSA Director Eligibility: Candidates must meet the following eligibility criteria, which constitute the constitutional floor for the Candidate Register the PM draws from: no currently held elected or appointed government position at any level; no current financial interest in any entity that operates, supplies, or seeks to operate or supply the National Record System's node infrastructure or technical standards; demonstrated expertise in at least one of — distributed systems or cryptographic infrastructure, public records management and archival systems, government information technology governance, or records system architecture and security; and no constitutional Rule Violation conviction during any prior period of federal service. The Legislature may by statute establish additional qualification requirements consistent with this floor. The PM may not nominate a candidate who does not meet this floor, and the EI publishes a finding if a submitted nominee falls below it before the Senate confirmation vote proceeds. Before any nomination may proceed, the PM must submit a candidate disclosure record to the Executive Inspectorate. The record must include the candidate's professional background, relevant expertise, financial disclosures, and any prior government positions held. The Executive Inspectorate reviews the submitted record for factual accuracy, applies the constitutional eligibility criteria, and publishes the record together with its recommendation — whether the submitted record demonstrates the criteria are met — to the National Record System before the confirming chamber votes. Where the EI identifies a material factual inaccuracy in the submitted record, it publishes a specific discrepancy finding; the nominating authority may submit a corrected record within a Legislature-defined period, which the EI reviews and publishes alongside the original. Both the original and any corrected records remain permanently on the National Record System. Any citizen who identifies a discrepancy in a published candidate record may petition their elected representative — House member or Senator — who may raise the matter through the confirmation process or request an investigation through proper channels. The nomination and confirmation record are published permanently. If the Senate fails to act on a nomination within the period the Legislature defines by statute, the nominee assumes acting status and performs all constitutional functions of the office. The acting officer escalation framework of §2.2.h applies from the date of assumption. Confirmation by the Senate at any time converts acting status to permanent appointment and the full term begins from the date of confirmation. The RSA Director serves a single non-renewable 7-year term. Removal of a permanently confirmed RSA Director requires a 2/3 vote of both chambers simultaneously and a documented finding of dereliction by the Executive Inspectorate published to the National Record System before the legislative vote may proceed. Upon any mid-term vacancy — through death, resignation, or removal — the most senior RSA technical staff member designated by the Legislature by statute assumes acting status immediately and the PM must nominate a replacement within 60 days. The acting officer escalation provisions of this section apply from the date of assumption. A replacement confirmed through Senate confirmation serves a full new 7-year non-renewable term from the date of confirmation.</w:t>
+        <w:t>The RSA Director is nominated by the Prime Minister from a Candidate Register. RSA Director Eligibility: Candidates must meet the following eligibility criteria, which constitute the constitutional floor for the Candidate Register the PM draws from: no currently held elected or appointed government position at any level; no current financial interest in any entity that operates, supplies, or seeks to operate or supply the National Record System's node infrastructure or technical standards; demonstrated expertise in at least one of — distributed systems or cryptographic infrastructure, public records management and archival systems, government information technology governance, or records system architecture and security; and no criminal conviction for conduct committed while holding federal office of federal service. The Legislature may by statute establish additional qualification requirements consistent with this floor. The PM may not nominate a candidate who does not meet this floor, and the EI publishes a finding if a submitted nominee falls below it before the Senate confirmation vote proceeds. Before any nomination may proceed, the PM must submit a candidate disclosure record to the Executive Inspectorate. The record must include the candidate's professional background, relevant expertise, financial disclosures, and any prior government positions held. The Executive Inspectorate reviews the submitted record for factual accuracy, applies the constitutional eligibility criteria, and publishes the record together with its recommendation — whether the submitted record demonstrates the criteria are met — to the National Record System before the confirming chamber votes. Where the EI identifies a material factual inaccuracy in the submitted record, it publishes a specific discrepancy finding; the nominating authority may submit a corrected record within a Legislature-defined period, which the EI reviews and publishes alongside the original. Both the original and any corrected records remain permanently on the National Record System. Any citizen who identifies a discrepancy in a published candidate record may petition their elected representative — House member or Senator — who may raise the matter through the confirmation process or request an investigation through proper channels. The nomination and confirmation record are published permanently. If the Senate fails to act on a nomination within the period the Legislature defines by statute, the nominee assumes acting status and performs all constitutional functions of the office. The acting officer escalation framework of §2.2.h applies from the date of assumption. Confirmation by the Senate at any time converts acting status to permanent appointment and the full term begins from the date of confirmation. The RSA Director serves a single non-renewable 7-year term. Removal of a permanently confirmed RSA Director requires a 2/3 vote of both chambers simultaneously and a documented finding of dereliction by the Executive Inspectorate published to the National Record System before the legislative vote may proceed. Upon any mid-term vacancy — through death, resignation, or removal — the most senior RSA technical staff member designated by the Legislature by statute assumes acting status immediately and the PM must nominate a replacement within 60 days. The acting officer escalation provisions of this section apply from the date of assumption. A replacement confirmed through Senate confirmation serves a full new 7-year non-renewable term from the date of confirmation.</w:t>
       </w:r>
     </w:p>
     <w:p>
@@ -8545,7 +8300,7 @@
           <w:sz w:val="22"/>
           <w:szCs w:val="22"/>
         </w:rPr>
-        <w:t xml:space="preserve">Only the President may classify national defense and diplomatic operational information. Only the Prime Minister may classify domestic information with genuine national security implications. Neither executive may delegate classification authority below their respective Council level. No other official, body, or instrumentality may classify information — any purported classification by an unauthorized party is void. the Legislature may not independently classify information. the Legislature must by statute define the procedures for maintaining confidentiality of classified executive briefings provided for oversight purposes. The President must brief the Prime Minister on classified intelligence that bears materially on the Prime Minister's domestic functions, subject to security protocols the Legislature defines by statute. The briefing obligation operates independently of and does not limit the President's classification authority. A President who classifies information specifically to prevent the Prime Minister from performing domestic constitutional functions commits a Rule Violation regardless of whether the underlying classification is otherwise valid.</w:t>
+        <w:t>Only the President may classify national defense and diplomatic operational information. Only the Prime Minister may classify domestic information with genuine national security implications. Neither executive may delegate classification authority below their respective Council level. No other official, body, or instrumentality may classify information — any purported classification by an unauthorized party is void. the Legislature may not independently classify information. the Legislature must by statute define the procedures for maintaining confidentiality of classified executive briefings provided for oversight purposes. The President must brief the Prime Minister on classified intelligence that bears materially on the Prime Minister's domestic functions, subject to security protocols the Legislature defines by statute. The briefing obligation operates independently of and does not limit the President's classification authority. A President who classifies information specifically to prevent the Prime Minister from performing domestic constitutional functions is constitutionally prohibited regardless of whether the underlying classification is otherwise valid.</w:t>
       </w:r>
     </w:p>
     <w:p>
@@ -8597,7 +8352,7 @@
           <w:sz w:val="22"/>
           <w:szCs w:val="22"/>
         </w:rPr>
-        <w:t xml:space="preserve">The existence of every classified document must be registered on the National Record System within 24 hours of classification — citizens know classified documents exist even if they cannot read them. The registration must include: the classifying authority; the date; a description in terms that do not reveal classified content; and the scheduled declassification date. Failure to register promptly is a Rule Violation. the Legislature defines registration timelines and format by statute.</w:t>
+        <w:t>The existence of every classified document must be registered on the National Record System within 24 hours of classification — citizens know classified documents exist even if they cannot read them. The registration must include: the classifying authority; the date; a description in terms that do not reveal classified content; and the scheduled declassification date. Failure to register promptly is constitutionally required and the omission is reported to the NRS. the Legislature defines registration timelines and format by statute.</w:t>
       </w:r>
     </w:p>
     <w:p>
@@ -8649,7 +8404,7 @@
           <w:sz w:val="22"/>
           <w:szCs w:val="22"/>
         </w:rPr>
-        <w:t xml:space="preserve">Classification used to conceal a Rule Violation, illegal order, or policy decision — rather than genuinely sensitive operational material — is improper classification and itself a Rule Violation. A court finding of improper classification triggers automatic declassification and immediate NRS publication. Any citizen or Inspectorate may petition the Supreme Court to review a classification decision; the burden is on the classifying authority to demonstrate the material is genuinely operationally sensitive.</w:t>
+        <w:t>Classification used to conceal a constitutional violation, illegal order, or policy decision — rather than genuinely sensitive operational material — is improper classification and is reported to the National Record System by the relevant Inspectorate. A court finding of improper classification triggers automatic declassification and immediate NRS publication. Any citizen or Inspectorate may petition the Supreme Court to review a classification decision; the burden is on the classifying authority to demonstrate the material is genuinely operationally sensitive.</w:t>
       </w:r>
     </w:p>
     <w:p>
@@ -8748,7 +8503,7 @@
           <w:sz w:val="22"/>
           <w:szCs w:val="22"/>
         </w:rPr>
-        <w:t xml:space="preserve">The Monetary Authority's annual revenue assessment must include a determination of whether the current statutory band meaningfully scales Basic Needs support with economic performance. If the Executive Inspectorate publishes a finding that the statutory band has been set in a manner that functionally eliminates scaling — effectively fixing the rate at or near the constitutional minimum regardless of economic conditions — the Legislature has 45 days from the date the finding is published to address the band by statute. The 45-day window begins on the NRS publication date and is tolled if the Legislature cannot convene due to dissolution or emergency, with a maximum toll of 90 days. If the Legislature fails to act within 45 days (or the tolled period), the relevant statute automatically becomes eligible for referendum under Article XI without requiring a citizen petition.</w:t>
+        <w:t>The Monetary Authority's annual revenue assessment must include a determination of whether the current statutory band meaningfully scales Basic Needs support with economic performance. If the Executive Inspectorate publishes a finding that the statutory band has been set in a manner that functionally eliminates scaling — effectively fixing the rate at or near the constitutional minimum regardless of economic conditions — the Legislature has 45 days from the date the finding is published to address the band by statute. The 45-day window begins on the NRS publication date and is tolled if the Legislature cannot convene due to caretaker period or emergency, with a maximum toll of 90 days. If the Legislature fails to act within 45 days (or the tolled period), the relevant statute automatically becomes eligible for referendum under Article XI without requiring a citizen petition.</w:t>
       </w:r>
     </w:p>
     <w:p>
@@ -8937,6 +8692,26 @@
     </w:p>
     <w:p>
       <w:pPr>
+        <w:spacing w:before="60" w:after="60" w:line="280" w:lineRule="auto"/>
+        <w:jc w:val="both"/>
+      </w:pPr>
+      <w:r>
+        <w:rPr>
+          <w:b/>
+          <w:sz w:val="22"/>
+          <w:color w:val="1B2A4A"/>
+        </w:rPr>
+        <w:t xml:space="preserve">10.2.a Legislative Pay Withholding During Budget Failure: </w:t>
+      </w:r>
+      <w:r>
+        <w:rPr>
+          <w:sz w:val="22"/>
+        </w:rPr>
+        <w:t xml:space="preserve">Where the 90-day continuation period has expired and discretionary government spending has been suspended under §10.2, the pay of all members of both chambers of the Legislature is withheld from the same date on which government employee pay is withheld — no earlier and no later. Withheld legislator pay is held and released in full to each member within 14 days of the Legislature enacting a budget. Pay withheld under this provision is not forfeited — members are compensated for the full period once the budget is enacted, reflecting that legislators continue performing their duties during the impasse. No member may receive advance pay, loans from government sources, or any other compensation from public funds as a substitute for withheld pay during this period. The Monetary Authority publishes to the National Record System a running daily count of the number of days legislator pay has been withheld under this provision, alongside the corresponding count for general government employees. Both counts are publicly accessible from the date withholding begins.</w:t>
+      </w:r>
+    </w:p>
+    <w:p>
+      <w:pPr>
         <w:pBdr>
           <w:bottom w:val="single" w:color="7A7060" w:sz="2" w:space="4"/>
         </w:pBdr>
@@ -9089,7 +8864,7 @@
           <w:sz w:val="22"/>
           <w:szCs w:val="22"/>
         </w:rPr>
-        <w:t xml:space="preserve">A candidate for the Director position is disqualified from appearing on the ballot if they: (1) currently hold any elected or appointed government position at any level — federal, State, or Territorial; (2) hold a current financial interest whose value is materially and directly affected by MA monetary policy decisions, including positions in instruments directly priced by interest rate decisions and significant ownership interests in entities subject to MA fiscal certification; (3) are not a Republic citizen; or (4) were convicted of a constitutional Rule Violation during any prior period of federal service. These four criteria are the sole disqualifying circumstances. The electorate determines the qualification of candidates through the information environment established by this section — not through institutional gatekeeping beyond this narrow objective set.</w:t>
+        <w:t>A candidate for the Director position is disqualified from appearing on the ballot if they: (1) currently hold any elected or appointed government position at any level — federal, State, or Territorial; (2) hold a current financial interest whose value is materially and directly affected by MA monetary policy decisions, including positions in instruments directly priced by interest rate decisions and significant ownership interests in entities subject to MA fiscal certification; (3) are not a Republic citizen; or (4) were convicted of a criminal offense committed while holding federal office during any prior period of federal service. These four criteria are the sole disqualifying circumstances. The electorate determines the qualification of candidates through the information environment established by this section — not through institutional gatekeeping beyond this narrow objective set.</w:t>
       </w:r>
     </w:p>
     <w:p>
@@ -9115,7 +8890,7 @@
           <w:sz w:val="22"/>
           <w:szCs w:val="22"/>
         </w:rPr>
-        <w:t xml:space="preserve">The Executive Inspectorate maintains a standing MA Director Candidate Register, continuously open and publicly accessible on the National Record System. Any citizen who intends to seek the Director position must register and submit a full disclosure record covering: professional history and any relevant expertise in monetary policy, public finance, macroeconomics, national income accounting, or related fields; all financial interests and holdings; all prior elected or appointed government positions; all prior party memberships and documented partisan political activity; and any prior constitutional Rule Violation findings. The disclosure record is published to the NRS in full upon submission. A registered candidate must notify the EI within 30 days of any material change in their circumstances, including the acquisition of a disqualifying financial interest or a government position. The Executive Inspectorate reviews each submitted disclosure record for factual accuracy only — it does not assess the quality, depth, or relevance of a candidate's expertise, nor does it evaluate whether the expertise disclosed is sufficient for the position. Where the EI identifies a material factual inaccuracy, it publishes a specific discrepancy finding to the NRS; the candidate may submit a corrected record within a Legislature-defined period, which the EI reviews and publishes alongside the original. Where a candidate's disclosure — accurate or corrected — reveals a disqualifying circumstance under the four criteria above, the EI removes the candidate from the ballot and publishes the specific grounds to the NRS. Where the disclosure is factually accurate and discloses no disqualifying circumstance, the candidate proceeds to the ballot regardless of the content of the disclosure — including where the disclosure reveals limited or no expertise in monetary economics. Removal from the ballot by the EI may be appealed to the Supreme Court within 14 days; the Court reviews only whether the disqualifying criterion is met, not the merits of any expertise assessment.</w:t>
+        <w:t>The Executive Inspectorate maintains a standing MA Director Candidate Register, continuously open and publicly accessible on the National Record System. Any citizen who intends to seek the Director position must register and submit a full disclosure record covering: professional history and any relevant expertise in monetary policy, public finance, macroeconomics, national income accounting, or related fields; all financial interests and holdings; all prior elected or appointed government positions; all prior party memberships and documented partisan political activity; and any prior constitutional constitutional violation findings. The disclosure record is published to the NRS in full upon submission. A registered candidate must notify the EI within 30 days of any material change in their circumstances, including the acquisition of a disqualifying financial interest or a government position. The Executive Inspectorate reviews each submitted disclosure record for factual accuracy only — it does not assess the quality, depth, or relevance of a candidate's expertise, nor does it evaluate whether the expertise disclosed is sufficient for the position. Where the EI identifies a material factual inaccuracy, it publishes a specific discrepancy finding to the NRS; the candidate may submit a corrected record within a Legislature-defined period, which the EI reviews and publishes alongside the original. Where a candidate's disclosure — accurate or corrected — reveals a disqualifying circumstance under the four criteria above, the EI removes the candidate from the ballot and publishes the specific grounds to the NRS. Where the disclosure is factually accurate and discloses no disqualifying circumstance, the candidate proceeds to the ballot regardless of the content of the disclosure — including where the disclosure reveals limited or no expertise in monetary economics. Removal from the ballot by the EI may be appealed to the Supreme Court within 14 days; the Court reviews only whether the disqualifying criterion is met, not the merits of any expertise assessment.</w:t>
       </w:r>
     </w:p>
     <w:p>
@@ -9167,7 +8942,7 @@
           <w:sz w:val="22"/>
           <w:szCs w:val="22"/>
         </w:rPr>
-        <w:t xml:space="preserve">Candidates for the MA board must meet the following eligibility criteria, which constitute the constitutional floor for the Candidate Register the PM draws from: at least 5 years of professional experience in monetary policy, macroeconomics, public finance, fiscal policy, or a closely related field; no currently held elected or appointed government position; no current financial interest materially and directly affected by MA monetary policy decisions; and no constitutional Rule Violation conviction during any prior period of federal service. The Legislature may by statute establish additional qualification requirements consistent with this floor. The board Candidate Register is maintained by the Executive Inspectorate, is publicly accessible on the NRS, and is subject to the same disclosure and factual review requirements as the Director Candidate Register. These criteria are the constitutional eligibility floor — the PM may not nominate a candidate who does not meet them, and the EI publishes a finding if a submitted nominee falls below this floor before the Senate confirmation vote proceeds.</w:t>
+        <w:t>Candidates for the MA board must meet the following eligibility criteria, which constitute the constitutional floor for the Candidate Register the PM draws from: at least 5 years of professional experience in monetary policy, macroeconomics, public finance, fiscal policy, or a closely related field; no currently held elected or appointed government position; no current financial interest materially and directly affected by MA monetary policy decisions; and no criminal conviction for conduct committed while holding federal office of federal service. The Legislature may by statute establish additional qualification requirements consistent with this floor. The board Candidate Register is maintained by the Executive Inspectorate, is publicly accessible on the NRS, and is subject to the same disclosure and factual review requirements as the Director Candidate Register. These criteria are the constitutional eligibility floor — the PM may not nominate a candidate who does not meet them, and the EI publishes a finding if a submitted nominee falls below this floor before the Senate confirmation vote proceeds.</w:t>
       </w:r>
     </w:p>
     <w:p>
@@ -9297,7 +9072,7 @@
           <w:sz w:val="22"/>
           <w:szCs w:val="22"/>
         </w:rPr>
-        <w:t xml:space="preserve">The Monetary Authority may not be directed, overruled, or pressured by either executive or by the Legislature. Its mandate is price stability and fiscal solvency. The Director's veto and the board's override authority operate within this independence mandate — neither the veto nor the override may be exercised in response to political direction from any external actor. Any Director or board member who exercises their veto or override authority in response to political direction from either executive or the Legislature commits a Rule Violation. All board determinations, Director vetoes, board overrides, and dissenting methodological assessments are published to the National Record System immediately upon issue, ensuring that any pattern of politically-directed decision-making is permanently documented.</w:t>
+        <w:t>The Monetary Authority may not be directed, overruled, or pressured by either executive or by the Legislature. Its mandate is price stability and fiscal solvency. The Director's veto and the board's override authority operate within this independence mandate — neither the veto nor the override may be exercised in response to political direction from any external actor. Any Director or board member who exercises their veto or override authority in response to political direction from either executive or the Legislature is constitutionally prohibited. All board determinations, Director vetoes, board overrides, and dissenting methodological assessments are published to the National Record System immediately upon issue, ensuring that any pattern of politically-directed decision-making is permanently documented.</w:t>
       </w:r>
     </w:p>
     <w:p>
@@ -9446,7 +9221,7 @@
           <w:sz w:val="22"/>
           <w:szCs w:val="22"/>
         </w:rPr>
-        <w:t xml:space="preserve">Every elected and appointed official must file a complete public financial disclosure statement within 30 days of taking office and annually thereafter. The disclosure must include all assets, liabilities, income sources, business interests, and financial interests of the official and their immediate family members. Disclosures are published to the National Record System within 7 days of filing. Failure to file on time, material omission, or knowing misstatement is a Rule Violation. the Legislature defines by statute the specific content requirements, the de minimis thresholds, and the verification process, consistent with this section.</w:t>
+        <w:t>Every elected and appointed official must file a complete public financial disclosure statement within 30 days of taking office and annually thereafter. The disclosure must include all assets, liabilities, income sources, business interests, and financial interests of the official and their immediate family members. Disclosures are published to the National Record System within 7 days of filing. Failure to file on time, material omission, or knowing misstatement is prohibited and reported to the NRS by the Executive Inspectorate. the Legislature defines by statute the specific content requirements, the de minimis thresholds, and the verification process, consistent with this section.</w:t>
       </w:r>
     </w:p>
     <w:p>
@@ -9524,7 +9299,7 @@
           <w:sz w:val="22"/>
           <w:szCs w:val="22"/>
         </w:rPr>
-        <w:t xml:space="preserve">All documents, communications, records, and data created by any official in their official capacity belong to the Republic, not to the official personally. Officials may not remove, destroy, retain, or transfer official records upon leaving office. All official records must be deposited with the National Record System or a constitutionally recognized archive within 30 days of an official's departure from office. Personal notes, private correspondence conducted outside official channels, and materials created entirely outside official capacity remain personal property. An official who removes, destroys, or retains official records commits a Rule Violation; recoverable records are subject to forfeiture to the Republic regardless of where they are found.</w:t>
+        <w:t>All documents, communications, records, and data created by any official in their official capacity belong to the Republic, not to the official personally. Officials may not remove, destroy, retain, or transfer official records upon leaving office. All official records must be deposited with the National Record System or a constitutionally recognized archive within 30 days of an official's departure from office. Personal notes, private correspondence conducted outside official channels, and materials created entirely outside official capacity remain personal property. An official who removes, destroys, or retains official records is prohibited; recoverable records are subject to forfeiture to the Republic regardless of where they are found.</w:t>
       </w:r>
     </w:p>
     <w:p>
@@ -9550,7 +9325,7 @@
           <w:sz w:val="22"/>
           <w:szCs w:val="22"/>
         </w:rPr>
-        <w:t xml:space="preserve">Gifts received by any official in their official capacity — from foreign governments, domestic entities, corporations, or private individuals — belong to the Republic. Officials may not retain gifts received in an official context. Gifts below a de minimis value defined by House statute may be returned to the giver or kept at the official's personal discretion. Gifts above that threshold must be catalogued and deposited with a national archive or museum, auctioned for the public benefit, or returned to the giver — at the Republic's election. Retention of an official gift above the threshold without disclosure and deposit is a Rule Violation.</w:t>
+        <w:t>Gifts received by any official in their official capacity — from foreign governments, domestic entities, corporations, or private individuals — belong to the Republic. Officials may not retain gifts received in an official context. Gifts below a de minimis value defined by House statute may be returned to the giver or kept at the official's personal discretion. Gifts above that threshold must be catalogued and deposited with a national archive or museum, auctioned for the public benefit, or returned to the giver — at the Republic's election. Retention of an official gift above the threshold without disclosure and deposit is constitutionally prohibited.</w:t>
       </w:r>
     </w:p>
     <w:p>
@@ -9576,7 +9351,7 @@
           <w:sz w:val="22"/>
           <w:szCs w:val="22"/>
         </w:rPr>
-        <w:t xml:space="preserve">Works created by officials using government resources, government time, government information, or access derived from official position belong to the Republic. An official who commercially exploits official records, classified or sensitive information obtained through their position, or access derived from their role — including through post-service memoirs, speaking fees for disclosures of official matters, or consulting arrangements that monetize official information — commits a Rule Violation. This provision does not prevent officials from writing or speaking about their public service using publicly available information after their service concludes. For purposes of this provision, information that was classified at any point during the official's service is not treated as publicly available for 5 years following its declassification, regardless of its formal classification status when publication.</w:t>
+        <w:t>Works created by officials using government resources, government time, government information, or access derived from official position belong to the Republic. An official who commercially exploits official records, classified or sensitive information obtained through their position, or access derived from their role — including through post-service memoirs, speaking fees for disclosures of official matters, or consulting arrangements that monetize official information — is constitutionally prohibited. This provision does not prevent officials from writing or speaking about their public service using publicly available information after their service concludes. For purposes of this provision, information that was classified at any point during the official's service is not treated as publicly available for 5 years following its declassification, regardless of its formal classification status when publication.</w:t>
       </w:r>
     </w:p>
     <w:p>
@@ -9602,7 +9377,7 @@
           <w:sz w:val="22"/>
           <w:szCs w:val="22"/>
         </w:rPr>
-        <w:t xml:space="preserve">Every official of the Federated Republic — elected, appointed, or career — must take a constitutionally prescribed oath or affirmation before exercising any authority of their office. The oath is recorded on the National Record System within 24 hours of administration. An official who exercises authority before taking their oath commits a Rule Violation for each act taken without oath. The constitutional oaths are: the Official Oath, taken by all elected and appointed federal officials; the Military Oath, taken by all persons entering military service; and the Naturalization Pledge, taken by all persons earning citizenship. The text of these oaths is established by the Legislature by statute and must be consistent with the obligations of each office as defined by this Constitution. the Legislature establishes by statute the oath or affirmation for civil servants and inferior court judges.</w:t>
+        <w:t>Every official of the Federated Republic — elected, appointed, or career — must take a constitutionally prescribed oath or affirmation before exercising any authority of their office. The oath is recorded on the National Record System within 24 hours of administration. An official who exercises authority before taking their oath acts without constitutional authority. The constitutional oaths are: the Official Oath, taken by all elected and appointed federal officials; the Military Oath, taken by all persons entering military service; and the Naturalization Pledge, taken by all persons earning citizenship. The text of these oaths is established by the Legislature by statute and must be consistent with the obligations of each office as defined by this Constitution. the Legislature establishes by statute the oath or affirmation for civil servants and inferior court judges.</w:t>
       </w:r>
     </w:p>
     <w:p>
@@ -10110,7 +9885,7 @@
           <w:sz w:val="22"/>
           <w:szCs w:val="22"/>
         </w:rPr>
-        <w:t xml:space="preserve">The Senate Armed Services Committee exercises the Tier 2 military authorization function of §2.1.b. Its composition and procedures are defined by Senate statute, subject to the following constitutional minimums: the Committee must include both majority and minority Senate representation; its composition may not be altered during any active Tier 2 or Tier 3 military authorization period; and it must be capable of convening within 48 hours at any time. Committee members hold their positions for the duration of their Senate terms. Authorization decisions are published to the National Record System within 24 hours of the vote. Where the Senate Speaker or other constitutional successor assumes presidential defense functions under §2.6.a, the Senate Armed Services Committee may review but may not unilaterally pause, modify, or terminate ongoing operations already authorized by a Legislative Declaration without a new Senate vote meeting the threshold that authorized the original Declaration. This provision protects the operational continuity of constitutionally authorized military commitments during presidential succession events. Where two or more persons simultaneously claim presidential authority and the Supreme Court has issued a ruling identifying the constitutional President, all military commands must recognize the Court-identified President as the lawful Commander-in-Chief within 6 hours of the ruling's publication to the National Record System. Failure to transfer military command recognition within 6 hours of a Supreme Court ruling on presidential succession constitutes insubordination under military law and a Rule Violation for any commissioned officer who issues or follows orders from the non-Court-identified claimant after that 6-hour period.</w:t>
+        <w:t>The Senate Armed Services Committee exercises the Tier 2 military authorization function of §2.1.b. Its composition and procedures are defined by Senate statute, subject to the following constitutional minimums: the Committee must include both majority and minority Senate representation; its composition may not be altered during any active Tier 2 or Tier 3 military authorization period; and it must be capable of convening within 48 hours at any time. Committee members hold their positions for the duration of their Senate terms. Authorization decisions are published to the National Record System within 24 hours of the vote. Where the Senate Speaker or other constitutional successor assumes presidential defense functions under §2.6.a, the Senate Armed Services Committee may review but may not unilaterally pause, modify, or terminate ongoing operations already authorized by a Legislative Declaration without a new Senate vote meeting the threshold that authorized the original Declaration. This provision protects the operational continuity of constitutionally authorized military commitments during presidential succession events. Where two or more persons simultaneously claim presidential authority and the Supreme Court has issued a ruling identifying the constitutional President, all military commands must recognize the Court-identified President as the lawful Commander-in-Chief within 6 hours of the ruling's publication to the National Record System. Failure to transfer military command recognition within 6 hours of a Supreme Court ruling on presidential succession constitutes insubordination under military law and a constitutional violation for any commissioned officer who issues or follows orders from the non-Court-identified claimant after that 6-hour period.</w:t>
       </w:r>
     </w:p>
     <w:p>
@@ -10170,7 +9945,7 @@
           <w:sz w:val="22"/>
           <w:szCs w:val="22"/>
         </w:rPr>
-        <w:t xml:space="preserve">All domestic intelligence operations against Republic citizens are permanently prohibited. Any such order may trigger Rule Violation proceedings against the President and Director of Intelligence under §2.7, triggering immediate suspension and a Senate trial within a period the Legislature defines by statute, not to exceed 7 days.</w:t>
+        <w:t>All domestic intelligence operations against Republic citizens are permanently prohibited. Any such order is reported to the National Record System by the relevant Inspectorate against the President and Director of Intelligence, triggering immediate suspension and a Senate trial within a period the Legislature defines by statute, not to exceed 7 days.</w:t>
       </w:r>
     </w:p>
     <w:p>
@@ -10390,7 +10165,7 @@
         <w:t xml:space="preserve">12.6.f NRS Accountability: </w:t>
       </w:r>
       <w:r>
-        <w:t xml:space="preserve">All Offensive Operations Declarations, fund certifications, 180-day renewal votes, operational objective assessments, stand-down orders, and transition plan submissions are published to the National Record System within 24 hours of their occurrence. The Executive Inspectorate's annual military constitutional compliance assessment includes a dedicated section on offensive operations: whether ongoing operations are conducted within the declared geographic scope; whether fund certifications correspond to authorized operational purposes; and whether the non-aggression prohibition of §12.6.a is being observed. Any EI finding that operations have exceeded their authorized scope or purpose constitutes a Rule Violation referral under §2.7.</w:t>
+        <w:t>All Offensive Operations Declarations, fund certifications, 180-day renewal votes, operational objective assessments, stand-down orders, and transition plan submissions are published to the National Record System within 24 hours of their occurrence. The Executive Inspectorate's annual military constitutional compliance assessment includes a dedicated section on offensive operations: whether ongoing operations are conducted within the declared geographic scope; whether fund certifications correspond to authorized operational purposes; and whether the non-aggression prohibition of §12.6.a is being observed. Any EI finding that operations have exceeded their authorized scope or purpose constitutes a published to the National Record System by the relevant Inspectorate.</w:t>
       </w:r>
     </w:p>
     <w:p>
@@ -10597,7 +10372,7 @@
           <w:sz w:val="22"/>
           <w:szCs w:val="22"/>
         </w:rPr>
-        <w:t xml:space="preserve">A defined geographic subdivision of an existing Territory — including a Territory created by State Devolution under §13.3 — may petition for Statehood independently of the remainder of that Territory, subject to the following requirements. First, the petitioning subdivision must itself meet both Statehood Audit criteria of §13.2.a through §13.2.b when assessed as a standalone entity. Second, at least 60% of eligible voters within the proposed subdivision must affirmatively support the petition, as verified by NVS referendum. Third, the Domestic Affairs Council must certify that the remaining territory retains viable governance capacity — meaning sufficient population, fiscal resources, and administrative infrastructure to sustain basic government functions and continue pursuing Statehood independently. Fourth, the Legislative Inspectorate must certify that the proposed subdivision's boundaries are geographically contiguous and administratively coherent — they must correspond to existing county, municipal, or natural boundaries rather than being drawn to capture favorable demographics. Fifth, the subdivision of a territory may not leave the remaining territory below the population threshold required to maintain at least one House seat under §3.1.b. The remaining territory retains all Article I rights, all Basic Needs Floor protections, and continues under PM domestic oversight and LI compliance review, pursuing its own path to Statehood. The partial petition process follows the standard Statehood Audit and Provisional Membership Period; the original territory's audit failures do not transfer to the petitioning subdivision if that subdivision meets the criteria independently. Conditional viability certification: the LI may certify viability conditionally where specific, time-limited measures must support the remaining territory through the transition. A conditional certification is valid and satisfies the third requirement of this section; the conditions must be published to the National Record System and their fulfillment is audited annually LI audit. legislative review of the conditions is triggered only if the petitioning subdivision formally contests them within 14 days of publication, not by objection from the remaining territory alone.</w:t>
+        <w:t>A defined geographic subdivision of an existing Territory — including a Territory created by State Devolution under §13.3 — may petition for Statehood independently of the remainder of that Territory, subject to the following requirements. First, the petitioning subdivision must itself meet both Statehood Audit criteria of §13.2.a through §13.2.b when assessed as a standalone entity. Second, at least 60% of eligible voters within the proposed subdivision must affirmatively support the petition, as verified by NVS referendum. Third, the Domestic Affairs Council must certify that the remaining territory retains viable governance capacity — meaning sufficient population, fiscal resources, and administrative infrastructure to sustain basic government functions and continue pursuing Statehood independently. Fourth, the Legislative Inspectorate must certify that the proposed subdivision's boundaries are geographically contiguous and administratively coherent — they must correspond to existing county, municipal, or natural boundaries rather than being drawn to capture favorable demographics. Fifth, the subdivision of a territory may not leave the remaining territory below the population threshold required to maintain at least one House seat under §3.1.b. The remaining territory retains all Article I rights, all Basic Needs Floor protections, and continues under PM domestic oversight and LI compliance review, pursuing its own path to Statehood. The partial petition process follows the standard Statehood Audit and Provisional Membership Period; the original territory's audit failures do not transfer to the petitioning subdivision if that subdivision meets the criteria independently. Conditional viability certification: the LI may certify viability conditionally where specific, time-limited measures must support the remaining territory through the transition. A conditional certification is valid and satisfies the third requirement of this section; the conditions must be published to the National Record System and their fulfillment is audited annually LI audit. Legislative review of the conditions is triggered only if the petitioning subdivision formally contests them within 14 days of publication, not by objection from the remaining territory alone.</w:t>
       </w:r>
     </w:p>
     <w:p>
@@ -12831,7 +12606,7 @@
           <w:sz w:val="22"/>
           <w:szCs w:val="22"/>
         </w:rPr>
-        <w:t xml:space="preserve">Where any Electoral Commission seat becomes vacant mid-term through death, resignation, removal, or expulsion, the vacancy is filled as follows. For seats originally filled by national popular vote: a special election is held within 90 days through the National Voting System; the replacement serves the remainder of the original term, not a new 6-year term. For seats originally filled by joint session of the Legislature: a joint session is convened within 90 days and elects a replacement by RCV from qualified candidates vetted by the Judicial Inspectorate; the replacement serves the remainder of the original term. During any vacancy period, the remaining seated Commission members constitute a quorum and continue operating. the Legislature must by statute define the minimum quorum for Commission operations, which must be a majority of the currently seated members and must produce an odd voting number to preserve the Commission's tie-prevention architecture. If a vacancy reduces the Commission below the statutory quorum, the most senior remaining member assumes expanded operational authority pending the special election or joint session. House Dissolution — Joint Session Contingency: Where a House dissolution under §2.3.a is active at the time an Electoral Commission seat that would ordinarily be filled by joint session under §16.1 becomes vacant, the Senate alone acts in the capacity of the Legislature for this purpose and elects the replacement by absolute majority of its full seated membership, applying the same qualified-candidate and JI-vetting requirements as a standard joint session. The replacement serves only the remainder of the original term. Upon the House being reconstituted, the Senate-elected replacement continues in office for the remainder of their term; the next standard vacancy or election cycle proceeds normally.</w:t>
+        <w:t>Where any Electoral Commission seat becomes vacant mid-term through death, resignation, removal, or expulsion, the vacancy is filled as follows. For seats originally filled by national popular vote: a special election is held within 90 days through the National Voting System; the replacement serves the remainder of the original term, not a new 6-year term. For seats originally filled by joint session of the Legislature: a joint session is convened within 90 days and elects a replacement by RCV from qualified candidates vetted by the Judicial Inspectorate; the replacement serves the remainder of the original term. During any vacancy period, the remaining seated Commission members constitute a quorum and continue operating. the Legislature must by statute define the minimum quorum for Commission operations, which must be a majority of the currently seated members and must produce an odd voting number to preserve the Commission's tie-prevention architecture. If a vacancy reduces the Commission below the statutory quorum, the most senior remaining member assumes expanded operational authority pending the special election or joint session. House Caretaker Period — Joint Session Contingency: Where a House caretaker period under §2.3.a is active at the time an Electoral Commission seat that would ordinarily be filled by joint session under §16.1 becomes vacant, the Senate alone acts in the capacity of the Legislature for this purpose and elects the replacement by absolute majority of its full seated membership, applying the same qualified-candidate and JI-vetting requirements as a standard joint session. The replacement serves only the remainder of the original term. Upon the House being reconstituted, the Senate-elected replacement continues in office for the remainder of their term; the next standard vacancy or election cycle proceeds normally.</w:t>
       </w:r>
     </w:p>
     <w:p>
@@ -13423,7 +13198,7 @@
           <w:sz w:val="22"/>
           <w:szCs w:val="22"/>
         </w:rPr>
-        <w:t xml:space="preserve">The federal government as trustee has an active, enforceable obligation to maintain the ecological integrity and public accessibility of National Trust lands. The Executive Inspectorate monitors stewardship compliance annually, cross-referenced with §1.22 (Right to a Healthy Environment). Failure to maintain stewardship standards may trigger Rule Violation proceedings and triggers a mandatory remediation plan.</w:t>
+        <w:t>The federal government as trustee has an active, enforceable obligation to maintain the ecological integrity and public accessibility of National Trust lands. The Executive Inspectorate monitors stewardship compliance annually, cross-referenced with §1.22 (Right to a Healthy Environment). Failure to maintain stewardship standards is reported to the National Record System by the relevant Inspectorate and triggers a mandatory remediation plan.</w:t>
       </w:r>
     </w:p>
     <w:p>
@@ -13553,7 +13328,7 @@
           <w:sz w:val="22"/>
           <w:szCs w:val="22"/>
         </w:rPr>
-        <w:t xml:space="preserve">The National Trust is administered by a National Trust Administrator nominated by the Prime Minister from a Candidate Register. Before any nomination may proceed, the PM must submit a candidate disclosure record to the Executive Inspectorate. The record must include the candidate's professional background, relevant expertise, financial disclosures, and any prior government positions held. The Executive Inspectorate reviews the submitted record for factual accuracy, applies the constitutional eligibility criteria, and publishes the record together with its recommendation — whether the submitted record demonstrates the criteria are met — to the National Record System before the confirming chamber votes. Where the EI identifies a material factual inaccuracy in the submitted record, it publishes a specific discrepancy finding; the nominating authority may submit a corrected record within a Legislature-defined period, which the EI reviews and publishes alongside the original. Both the original and any corrected records remain permanently on the National Record System. Any citizen who identifies a discrepancy in a published candidate record may petition their elected representative — House member or Senator — who may raise the matter through the confirmation process or request an investigation through proper channels. The nomination and confirmation record are published permanently. National Trust Administrator Eligibility: Candidates must meet the following eligibility criteria, which constitute the constitutional floor for the Candidate Register the PM draws from: no currently held elected or appointed government position at any level; no current financial interest in any entity that holds, develops, or seeks to develop National Trust lands, or that derives commercial benefit from activities within National Trust lands; demonstrated expertise in at least one of — ecological stewardship and conservation management, public land management and administration, environmental law, or natural resource governance; and no constitutional Rule Violation conviction during any prior period of federal service. The Legislature may by statute establish additional qualification requirements consistent with this floor. The PM may not nominate a candidate who does not meet this floor, and the EI publishes a finding if a submitted nominee falls below it before the Senate confirmation vote proceeds. The Administrator is confirmed by the Senate and serves a single non-renewable 5-year term. The Legislative Inspectorate audits National Trust management annually against the stewardship obligation of §17.4.b and publishes its findings to the NRS. If the Senate fails to act on a nomination within the period the Legislature defines by statute, the nominee assumes acting status and performs all constitutional functions of the office. The acting officer escalation framework of §2.2.h applies from the date of assumption. Confirmation by the Senate at any time converts acting status to permanent appointment and the full term begins from the date of confirmation. Removal of a permanently confirmed National Trust Administrator requires a 2/3 vote of both chambers simultaneously and a documented finding of dereliction by the Executive Inspectorate published to the National Record System before the legislative vote may proceed. Upon any mid-term vacancy — through death, resignation, or removal — the most senior National Trust administrative staff member designated by the Legislature by statute assumes acting status immediately and the PM must nominate a replacement within 60 days. The acting officer escalation provisions of this section apply from the date of assumption. A replacement confirmed through Senate confirmation serves a full new 5-year non-renewable term from the date of confirmation.</w:t>
+        <w:t>The National Trust is administered by a National Trust Administrator nominated by the Prime Minister from a Candidate Register. Before any nomination may proceed, the PM must submit a candidate disclosure record to the Executive Inspectorate. The record must include the candidate's professional background, relevant expertise, financial disclosures, and any prior government positions held. The Executive Inspectorate reviews the submitted record for factual accuracy, applies the constitutional eligibility criteria, and publishes the record together with its recommendation — whether the submitted record demonstrates the criteria are met — to the National Record System before the confirming chamber votes. Where the EI identifies a material factual inaccuracy in the submitted record, it publishes a specific discrepancy finding; the nominating authority may submit a corrected record within a Legislature-defined period, which the EI reviews and publishes alongside the original. Both the original and any corrected records remain permanently on the National Record System. Any citizen who identifies a discrepancy in a published candidate record may petition their elected representative — House member or Senator — who may raise the matter through the confirmation process or request an investigation through proper channels. The nomination and confirmation record are published permanently. National Trust Administrator Eligibility: Candidates must meet the following eligibility criteria, which constitute the constitutional floor for the Candidate Register the PM draws from: no currently held elected or appointed government position at any level; no current financial interest in any entity that holds, develops, or seeks to develop National Trust lands, or that derives commercial benefit from activities within National Trust lands; demonstrated expertise in at least one of — ecological stewardship and conservation management, public land management and administration, environmental law, or natural resource governance; and no criminal conviction for conduct committed while holding federal office of federal service. The Legislature may by statute establish additional qualification requirements consistent with this floor. The PM may not nominate a candidate who does not meet this floor, and the EI publishes a finding if a submitted nominee falls below it before the Senate confirmation vote proceeds. The Administrator is confirmed by the Senate and serves a single non-renewable 5-year term. The Legislative Inspectorate audits National Trust management annually against the stewardship obligation of §17.4.b and publishes its findings to the NRS. If the Senate fails to act on a nomination within the period the Legislature defines by statute, the nominee assumes acting status and performs all constitutional functions of the office. The acting officer escalation framework of §2.2.h applies from the date of assumption. Confirmation by the Senate at any time converts acting status to permanent appointment and the full term begins from the date of confirmation. Removal of a permanently confirmed National Trust Administrator requires a 2/3 vote of both chambers simultaneously and a documented finding of dereliction by the Executive Inspectorate published to the National Record System before the legislative vote may proceed. Upon any mid-term vacancy — through death, resignation, or removal — the most senior National Trust administrative staff member designated by the Legislature by statute assumes acting status immediately and the PM must nominate a replacement within 60 days. The acting officer escalation provisions of this section apply from the date of assumption. A replacement confirmed through Senate confirmation serves a full new 5-year non-renewable term from the date of confirmation.</w:t>
       </w:r>
     </w:p>
     <w:p>
@@ -13783,7 +13558,7 @@
           <w:sz w:val="22"/>
           <w:szCs w:val="22"/>
         </w:rPr>
-        <w:t xml:space="preserve">the Legislature must by statute establish a system of public campaign financing for all federal elections meeting these constitutional requirements, within three years of Phase 4 activation. Failure to enact within this period constitutes a Rule Violation for the presiding officer of each chamber; the EC must notify the Supreme Court within 30 days of the deadline. Interim Default: In the absence of a statutory system three years after Phase 4, the Electoral Commission must establish minimum public funding allocations for all federal candidates by published rule, drawing on available appropriated funds, with methodology published to the NRS. This default operates until the Legislature acts but does not satisfy the statutory requirement — the Rule Violation continues until the Legislature acts.</w:t>
+        <w:t>the Legislature must by statute establish a system of public campaign financing for all federal elections meeting these constitutional requirements, within three years of Phase 4 activation. Failure to enact within this period constitutes a constitutional violation for the presiding officer of each chamber; the EC must notify the Supreme Court within 30 days of the deadline. Interim Default: In the absence of a statutory system three years after Phase 4, the Electoral Commission must establish minimum public funding allocations for all federal candidates by published rule, drawing on available appropriated funds, with methodology published to the NRS. This default operates until the Legislature acts but does not satisfy the statutory requirement — the constitutional violation continues until the Legislature acts.</w:t>
       </w:r>
     </w:p>
     <w:p>
@@ -13947,7 +13722,7 @@
           <w:sz w:val="22"/>
           <w:szCs w:val="22"/>
         </w:rPr>
-        <w:t xml:space="preserve">The Campaign Finance Registry is a distinct system from the National Voting System. When making a contribution, a citizen uses their Citizen Voting Credential to verify their eligibility — confirming they are eligible to vote in the relevant jurisdiction. This verification is separate from the act of voting. The contributor also separately registers their real identity with the Campaign Finance Registry directly; the Registry stores real-name records that are distinct from the cryptographic identifiers used by the National Voting System. The Registry holds contributor identity; the NVS holds voting credentials. The two systems are linked only by the contribution transaction, and that link does not reveal any ballot choices. No information in the Campaign Finance Registry may be used to infer, investigate, or analyze any individual's voting behavior or ballot choices. Violation of this separation may trigger Rule Violation proceedings under §2.7.</w:t>
+        <w:t>The Campaign Finance Registry is a distinct system from the National Voting System. When making a contribution, a citizen uses their Citizen Voting Credential to verify their eligibility — confirming they are eligible to vote in the relevant jurisdiction. This verification is separate from the act of voting. The contributor also separately registers their real identity with the Campaign Finance Registry directly; the Registry stores real-name records that are distinct from the cryptographic identifiers used by the National Voting System. The Registry holds contributor identity; the NVS holds voting credentials. The two systems are linked only by the contribution transaction, and that link does not reveal any ballot choices. No information in the Campaign Finance Registry may be used to infer, investigate, or analyze any individual's voting behavior or ballot choices. Violation of this separation is reported to the National Record System by the relevant Inspectorate.7.</w:t>
       </w:r>
     </w:p>
     <w:p>
@@ -14386,7 +14161,7 @@
           <w:sz w:val="22"/>
           <w:szCs w:val="22"/>
         </w:rPr>
-        <w:t xml:space="preserve">the Legislature must by statute establish a Classification Review Commission within 90 days of Phase 4 activation to review predecessor-government classified documents. The Commission applies the criteria of §9.5 to determine whether pre-existing classified material was legitimately classified for genuine security reasons or improperly classified to conceal Rule Violations or policy decisions. Legitimately classified documents enter the §9.5 duration framework from Day Zero. Improperly classified documents are immediately declassified and published to the National Record System. Any person may petition the Supreme Court to challenge a Commission determination.</w:t>
+        <w:t>the Legislature must by statute establish a Classification Review Commission within 90 days of Phase 4 activation to review predecessor-government classified documents. The Commission applies the criteria of §9.5 to determine whether pre-existing classified material was legitimately classified for genuine security reasons or improperly classified to conceal constitutional violations or policy decisions. Legitimately classified documents enter the §9.5 duration framework from Day Zero. Improperly classified documents are immediately declassified and published to the National Record System. Any person may petition the Supreme Court to challenge a Commission determination.</w:t>
       </w:r>
     </w:p>
     <w:p>

</xml_diff>